<commit_message>
Actualizo y subo parte del proyecto
</commit_message>
<xml_diff>
--- a/Diagrama UML — GanaControl (Modulo Usuario y Alimentación y Nutrición).docx
+++ b/Diagrama UML — GanaControl (Modulo Usuario y Alimentación y Nutrición).docx
@@ -8,13 +8,31 @@
         <w:jc w:val="center"/>
       </w:pPr>
       <w:r>
-        <w:t xml:space="preserve">Evidencia: Diagrama UML — </w:t>
-      </w:r>
-      <w:r>
-        <w:t>GanaControl (Modulo Usuario y Alimentación y Nutrición</w:t>
-      </w:r>
-      <w:r>
-        <w:t>)</w:t>
+        <w:t xml:space="preserve">Home Page, </w:t>
+      </w:r>
+      <w:proofErr w:type="spellStart"/>
+      <w:r>
+        <w:t>Login</w:t>
+      </w:r>
+      <w:proofErr w:type="spellEnd"/>
+      <w:r>
+        <w:t xml:space="preserve"> y </w:t>
+      </w:r>
+      <w:proofErr w:type="spellStart"/>
+      <w:r>
+        <w:t>Dashboard</w:t>
+      </w:r>
+      <w:proofErr w:type="spellEnd"/>
+      <w:r>
+        <w:t xml:space="preserve"> del Proyecto </w:t>
+      </w:r>
+      <w:proofErr w:type="spellStart"/>
+      <w:r>
+        <w:t>GanaControl</w:t>
+      </w:r>
+      <w:proofErr w:type="spellEnd"/>
+      <w:r>
+        <w:t xml:space="preserve"> Web</w:t>
       </w:r>
     </w:p>
     <w:p/>
@@ -165,36 +183,79 @@
       </w:pPr>
       <w:r>
         <w:lastRenderedPageBreak/>
-        <w:t>Introducción</w:t>
-      </w:r>
-    </w:p>
-    <w:p>
-      <w:pPr>
-        <w:ind w:firstLine="720"/>
-      </w:pPr>
-      <w:r>
-        <w:t xml:space="preserve">La presente evidencia tiene como objetivo presentar los diagramas UML correspondientes a los módulos de </w:t>
+        <w:t xml:space="preserve">Home Page, </w:t>
+      </w:r>
+      <w:proofErr w:type="spellStart"/>
+      <w:r>
+        <w:t>Login</w:t>
+      </w:r>
+      <w:proofErr w:type="spellEnd"/>
+      <w:r>
+        <w:t xml:space="preserve"> y </w:t>
+      </w:r>
+      <w:proofErr w:type="spellStart"/>
+      <w:r>
+        <w:t>Dashboard</w:t>
+      </w:r>
+      <w:proofErr w:type="spellEnd"/>
+      <w:r>
+        <w:t xml:space="preserve"> del Proyecto </w:t>
+      </w:r>
+      <w:proofErr w:type="spellStart"/>
+      <w:r>
+        <w:t>GanaControl</w:t>
+      </w:r>
+      <w:proofErr w:type="spellEnd"/>
+      <w:r>
+        <w:t xml:space="preserve"> Web</w:t>
+      </w:r>
+    </w:p>
+    <w:p>
+      <w:r>
+        <w:t xml:space="preserve">Este documento presenta la implementación realizada de la </w:t>
       </w:r>
       <w:r>
         <w:rPr>
           <w:b/>
           <w:bCs/>
         </w:rPr>
-        <w:t>Usuario</w:t>
-      </w:r>
-      <w:r>
-        <w:t xml:space="preserve"> y </w:t>
+        <w:t>Home Page</w:t>
+      </w:r>
+      <w:r>
+        <w:t xml:space="preserve">, el </w:t>
       </w:r>
       <w:r>
         <w:rPr>
           <w:b/>
           <w:bCs/>
         </w:rPr>
-        <w:t>Alimentación y Nutrición</w:t>
-      </w:r>
+        <w:t xml:space="preserve">Formulario de </w:t>
+      </w:r>
+      <w:proofErr w:type="spellStart"/>
+      <w:r>
+        <w:rPr>
+          <w:b/>
+          <w:bCs/>
+        </w:rPr>
+        <w:t>Login</w:t>
+      </w:r>
+      <w:proofErr w:type="spellEnd"/>
+      <w:r>
+        <w:t xml:space="preserve"> y el </w:t>
+      </w:r>
+      <w:proofErr w:type="spellStart"/>
+      <w:r>
+        <w:rPr>
+          <w:b/>
+          <w:bCs/>
+        </w:rPr>
+        <w:t>Dashboard</w:t>
+      </w:r>
+      <w:proofErr w:type="spellEnd"/>
       <w:r>
         <w:t xml:space="preserve"> del proyecto </w:t>
       </w:r>
+      <w:proofErr w:type="spellStart"/>
       <w:r>
         <w:rPr>
           <w:b/>
@@ -202,385 +263,1049 @@
         </w:rPr>
         <w:t>GanaControl</w:t>
       </w:r>
-      <w:r>
-        <w:t>, un sistema de gestión ganadera desarrollado para optimizar los procesos de registro, control y seguimiento de la información relacionada con los usuarios y la alimentación del ganado. Estos módulos fueron diseñados y desarrollados completamente por mí, asegurando que la estructura y funcionalidad del sistema cumplan con los requerimientos del proyecto.</w:t>
-      </w:r>
-      <w:r>
-        <w:tab/>
-      </w:r>
-    </w:p>
-    <w:p>
-      <w:pPr>
-        <w:pStyle w:val="Ttulo1"/>
-      </w:pPr>
-      <w:r>
-        <w:t>Modulo Usuario</w:t>
-      </w:r>
-    </w:p>
-    <w:p>
-      <w:pPr>
-        <w:ind w:firstLine="720"/>
-      </w:pPr>
-      <w:r>
-        <w:t xml:space="preserve">El </w:t>
-      </w:r>
+      <w:proofErr w:type="spellEnd"/>
       <w:r>
         <w:rPr>
           <w:b/>
           <w:bCs/>
         </w:rPr>
-        <w:t>Módulo Usuario</w:t>
-      </w:r>
-      <w:r>
-        <w:t xml:space="preserve"> está diseñado para gestionar toda la información relacionada con los diferentes perfiles que interactúan con el sistema. Esto incluye la creación, modificación, consulta y eliminación de usuarios, así como la gestión de roles y permisos dentro de la aplicación.</w:t>
-      </w:r>
-    </w:p>
-    <w:p>
-      <w:pPr>
-        <w:ind w:firstLine="720"/>
-      </w:pPr>
-      <w:r>
-        <w:t xml:space="preserve">El diagrama UML refleja las </w:t>
-      </w:r>
+        <w:t xml:space="preserve"> Web</w:t>
+      </w:r>
+      <w:r>
+        <w:t xml:space="preserve">, integrando los componentes del </w:t>
+      </w:r>
+      <w:proofErr w:type="spellStart"/>
       <w:r>
         <w:rPr>
           <w:b/>
           <w:bCs/>
         </w:rPr>
-        <w:t>clases principales</w:t>
-      </w:r>
-      <w:r>
-        <w:t>, sus atributos y métodos, así como las relaciones entre ellas. Entre las clases más destacadas se encuentran:</w:t>
-      </w:r>
-    </w:p>
-    <w:p>
-      <w:pPr>
-        <w:numPr>
-          <w:ilvl w:val="0"/>
-          <w:numId w:val="24"/>
-        </w:numPr>
-      </w:pPr>
+        <w:t>Frontend</w:t>
+      </w:r>
+      <w:proofErr w:type="spellEnd"/>
       <w:r>
         <w:rPr>
           <w:b/>
           <w:bCs/>
         </w:rPr>
-        <w:t>Usuario:</w:t>
-      </w:r>
-      <w:r>
-        <w:t xml:space="preserve"> representa los datos personales y de acceso de cada usuario.</w:t>
-      </w:r>
-    </w:p>
-    <w:p>
-      <w:pPr>
-        <w:numPr>
-          <w:ilvl w:val="0"/>
-          <w:numId w:val="24"/>
-        </w:numPr>
-      </w:pPr>
+        <w:t xml:space="preserve"> (HTML, CSS, JS)</w:t>
+      </w:r>
+      <w:r>
+        <w:t xml:space="preserve"> y la estructura base del </w:t>
+      </w:r>
+      <w:proofErr w:type="spellStart"/>
       <w:r>
         <w:rPr>
           <w:b/>
           <w:bCs/>
         </w:rPr>
-        <w:t>Rol:</w:t>
-      </w:r>
-      <w:r>
-        <w:t xml:space="preserve"> define los permisos asociados a cada tipo de usuario.</w:t>
-      </w:r>
-    </w:p>
-    <w:p>
-      <w:pPr>
-        <w:numPr>
-          <w:ilvl w:val="0"/>
-          <w:numId w:val="24"/>
-        </w:numPr>
-      </w:pPr>
+        <w:t>Backend</w:t>
+      </w:r>
+      <w:proofErr w:type="spellEnd"/>
       <w:r>
         <w:rPr>
           <w:b/>
           <w:bCs/>
         </w:rPr>
-        <w:t>Gestión de Acceso:</w:t>
-      </w:r>
-      <w:r>
-        <w:t xml:space="preserve"> controla la autenticación y autorización dentro del sistema.</w:t>
-      </w:r>
-    </w:p>
-    <w:p>
-      <w:pPr>
-        <w:ind w:firstLine="720"/>
-      </w:pPr>
-      <w:r>
-        <w:t>Estas clases interactúan entre sí para garantizar que solo los usuarios autorizados puedan realizar ciertas operaciones, manteniendo la seguridad y eficiencia del sistema.</w:t>
-      </w:r>
-    </w:p>
-    <w:p/>
-    <w:p>
-      <w:r>
-        <w:lastRenderedPageBreak/>
-        <w:drawing>
-          <wp:anchor distT="0" distB="0" distL="114300" distR="114300" simplePos="0" relativeHeight="251658240" behindDoc="0" locked="0" layoutInCell="1" allowOverlap="1" wp14:anchorId="13CA08C6" wp14:editId="2B5C1D9A">
-            <wp:simplePos x="0" y="0"/>
-            <wp:positionH relativeFrom="margin">
-              <wp:align>right</wp:align>
-            </wp:positionH>
-            <wp:positionV relativeFrom="paragraph">
-              <wp:posOffset>187960</wp:posOffset>
-            </wp:positionV>
-            <wp:extent cx="5943600" cy="3992880"/>
-            <wp:effectExtent l="0" t="0" r="0" b="7620"/>
-            <wp:wrapSquare wrapText="bothSides"/>
-            <wp:docPr id="1732854148" name="Imagen 1"/>
-            <wp:cNvGraphicFramePr>
-              <a:graphicFrameLocks xmlns:a="http://schemas.openxmlformats.org/drawingml/2006/main" noChangeAspect="1"/>
-            </wp:cNvGraphicFramePr>
-            <a:graphic xmlns:a="http://schemas.openxmlformats.org/drawingml/2006/main">
-              <a:graphicData uri="http://schemas.openxmlformats.org/drawingml/2006/picture">
-                <pic:pic xmlns:pic="http://schemas.openxmlformats.org/drawingml/2006/picture">
-                  <pic:nvPicPr>
-                    <pic:cNvPr id="1732854148" name=""/>
-                    <pic:cNvPicPr/>
-                  </pic:nvPicPr>
-                  <pic:blipFill>
-                    <a:blip r:embed="rId9">
-                      <a:extLst>
-                        <a:ext uri="{28A0092B-C50C-407E-A947-70E740481C1C}">
-                          <a14:useLocalDpi xmlns:a14="http://schemas.microsoft.com/office/drawing/2010/main" val="0"/>
-                        </a:ext>
-                      </a:extLst>
-                    </a:blip>
-                    <a:stretch>
-                      <a:fillRect/>
-                    </a:stretch>
-                  </pic:blipFill>
-                  <pic:spPr>
-                    <a:xfrm>
-                      <a:off x="0" y="0"/>
-                      <a:ext cx="5943600" cy="3992880"/>
-                    </a:xfrm>
-                    <a:prstGeom prst="rect">
-                      <a:avLst/>
-                    </a:prstGeom>
-                  </pic:spPr>
-                </pic:pic>
-              </a:graphicData>
-            </a:graphic>
-          </wp:anchor>
-        </w:drawing>
-      </w:r>
-    </w:p>
-    <w:p/>
+        <w:t xml:space="preserve"> en PHP</w:t>
+      </w:r>
+      <w:r>
+        <w:t>, bajo el patrón Modelo–Vista–Controlador (MVC).</w:t>
+      </w:r>
+    </w:p>
+    <w:p>
+      <w:r>
+        <w:t>El propósito de esta entrega es evidenciar el avance en el desarrollo de los módulos correspondientes, la organización del proyecto y el funcionamiento general de la interfaz.</w:t>
+      </w:r>
+    </w:p>
     <w:p>
       <w:pPr>
         <w:pStyle w:val="Ttulo1"/>
       </w:pPr>
       <w:r>
-        <w:t>Modulo Alimentación y Nutrición</w:t>
-      </w:r>
-    </w:p>
-    <w:p>
-      <w:pPr>
-        <w:ind w:firstLine="720"/>
-      </w:pPr>
-      <w:r>
-        <w:t xml:space="preserve">El </w:t>
+        <w:t>Organización del Proyecto</w:t>
+      </w:r>
+    </w:p>
+    <w:p>
+      <w:r>
+        <w:t>El proyecto completo se encuentra en una carpeta llamada:</w:t>
+      </w:r>
+    </w:p>
+    <w:p>
+      <w:r>
+        <w:t>GANACONTROL WEB</w:t>
+      </w:r>
+    </w:p>
+    <w:p>
+      <w:r>
+        <w:t>Esta carpeta está disponible en el repositorio oficial del proyecto, donde puede ser descargada por cualquier usuario. La estructura interna está organizada en carpetas para vistas, estilos, scripts y archivos PHP.</w:t>
+      </w:r>
+    </w:p>
+    <w:p>
+      <w:pPr>
+        <w:pStyle w:val="Ttulo1"/>
+      </w:pPr>
+      <w:r>
+        <w:t>Módulos Implementados</w:t>
+      </w:r>
+    </w:p>
+    <w:p>
+      <w:pPr>
+        <w:pStyle w:val="Ttulo2"/>
+      </w:pPr>
+      <w:r>
+        <w:t>1.</w:t>
+      </w:r>
+      <w:r>
+        <w:t>1 Home Page</w:t>
+      </w:r>
+    </w:p>
+    <w:p>
+      <w:r>
+        <w:t>La Home Page es la pantalla inicial del proyecto. Sus principales características son:</w:t>
+      </w:r>
+    </w:p>
+    <w:p>
+      <w:pPr>
+        <w:numPr>
+          <w:ilvl w:val="0"/>
+          <w:numId w:val="26"/>
+        </w:numPr>
+      </w:pPr>
+      <w:r>
+        <w:t>Diseño limpio y adaptable.</w:t>
+      </w:r>
+    </w:p>
+    <w:p>
+      <w:pPr>
+        <w:numPr>
+          <w:ilvl w:val="0"/>
+          <w:numId w:val="26"/>
+        </w:numPr>
+      </w:pPr>
+      <w:r>
+        <w:t xml:space="preserve">Presentación del proyecto </w:t>
+      </w:r>
+      <w:proofErr w:type="spellStart"/>
+      <w:r>
+        <w:t>GanaControl</w:t>
+      </w:r>
+      <w:proofErr w:type="spellEnd"/>
+      <w:r>
+        <w:t>.</w:t>
+      </w:r>
+    </w:p>
+    <w:p>
+      <w:pPr>
+        <w:numPr>
+          <w:ilvl w:val="0"/>
+          <w:numId w:val="26"/>
+        </w:numPr>
+      </w:pPr>
+      <w:r>
+        <w:t xml:space="preserve">Estilos implementados con </w:t>
       </w:r>
       <w:r>
         <w:rPr>
           <w:b/>
           <w:bCs/>
         </w:rPr>
-        <w:t>Módulo Alimentación y Nutrición</w:t>
-      </w:r>
-      <w:r>
-        <w:t xml:space="preserve"> está enfocado en el registro y control de los planes alimenticios del ganado. Permite administrar la información sobre los tipos de alimento, cantidades, horarios de suministro y necesidades nutricionales específicas de cada animal o grupo de animales.</w:t>
-      </w:r>
-    </w:p>
-    <w:p>
-      <w:r>
-        <w:t>Dentro del diagrama UML, se destacan las siguientes clases:</w:t>
+        <w:t>CSS</w:t>
+      </w:r>
+      <w:r>
+        <w:t>.</w:t>
       </w:r>
     </w:p>
     <w:p>
       <w:pPr>
         <w:numPr>
           <w:ilvl w:val="0"/>
-          <w:numId w:val="25"/>
+          <w:numId w:val="26"/>
         </w:numPr>
       </w:pPr>
+      <w:r>
+        <w:t xml:space="preserve">Estructura en </w:t>
+      </w:r>
       <w:r>
         <w:rPr>
           <w:b/>
           <w:bCs/>
         </w:rPr>
-        <w:t>Animal:</w:t>
-      </w:r>
-      <w:r>
-        <w:t xml:space="preserve"> contiene información del ganado como especie, edad, peso y estado de salud.</w:t>
+        <w:t>HTML5</w:t>
+      </w:r>
+      <w:r>
+        <w:t>.</w:t>
       </w:r>
     </w:p>
     <w:p>
       <w:pPr>
         <w:numPr>
           <w:ilvl w:val="0"/>
-          <w:numId w:val="25"/>
+          <w:numId w:val="26"/>
         </w:numPr>
       </w:pPr>
+      <w:r>
+        <w:lastRenderedPageBreak/>
+        <w:t xml:space="preserve">Inclusión de scripts en </w:t>
+      </w:r>
       <w:r>
         <w:rPr>
           <w:b/>
           <w:bCs/>
         </w:rPr>
-        <w:t>Alimento:</w:t>
-      </w:r>
-      <w:r>
-        <w:t xml:space="preserve"> registra los tipos de alimento y sus propiedades nutricionales.</w:t>
+        <w:t>JavaScript</w:t>
+      </w:r>
+      <w:r>
+        <w:t xml:space="preserve"> para mejorar la interacción.</w:t>
       </w:r>
     </w:p>
     <w:p>
       <w:pPr>
         <w:numPr>
           <w:ilvl w:val="0"/>
-          <w:numId w:val="25"/>
+          <w:numId w:val="26"/>
         </w:numPr>
       </w:pPr>
+      <w:r>
+        <w:t xml:space="preserve">Botón o enlace directo hacia el módulo de </w:t>
+      </w:r>
+      <w:proofErr w:type="spellStart"/>
+      <w:r>
+        <w:t>Login</w:t>
+      </w:r>
+      <w:proofErr w:type="spellEnd"/>
+      <w:r>
+        <w:t>.</w:t>
+      </w:r>
+    </w:p>
+    <w:p>
+      <w:r>
+        <w:t>Esta página cumple la función de bienvenida y redirección hacia el acceso del sistema.</w:t>
+      </w:r>
+    </w:p>
+    <w:p>
+      <w:pPr>
+        <w:pStyle w:val="Ttulo2"/>
+      </w:pPr>
+      <w:r>
+        <w:t>1</w:t>
+      </w:r>
+      <w:r>
+        <w:t xml:space="preserve">.2 Formulario de </w:t>
+      </w:r>
+      <w:proofErr w:type="spellStart"/>
+      <w:r>
+        <w:t>Login</w:t>
+      </w:r>
+      <w:proofErr w:type="spellEnd"/>
+    </w:p>
+    <w:p>
+      <w:r>
+        <w:t>Se desarrolló el formulario de autenticación con los siguientes elementos:</w:t>
+      </w:r>
+    </w:p>
+    <w:p>
+      <w:pPr>
+        <w:numPr>
+          <w:ilvl w:val="0"/>
+          <w:numId w:val="27"/>
+        </w:numPr>
+      </w:pPr>
+      <w:r>
+        <w:t xml:space="preserve">Campos de ingreso para </w:t>
+      </w:r>
       <w:r>
         <w:rPr>
           <w:b/>
           <w:bCs/>
         </w:rPr>
-        <w:lastRenderedPageBreak/>
-        <w:t>Plan Alimenticio:</w:t>
-      </w:r>
-      <w:r>
-        <w:t xml:space="preserve"> define la programación de la alimentación según las necesidades del ganado.</w:t>
-      </w:r>
-    </w:p>
-    <w:p>
-      <w:pPr>
-        <w:numPr>
-          <w:ilvl w:val="0"/>
-          <w:numId w:val="25"/>
-        </w:numPr>
-      </w:pPr>
+        <w:t>correo</w:t>
+      </w:r>
+      <w:r>
+        <w:t xml:space="preserve"> y </w:t>
+      </w:r>
       <w:r>
         <w:rPr>
           <w:b/>
           <w:bCs/>
         </w:rPr>
-        <w:t>Registro de Alimentación:</w:t>
-      </w:r>
-      <w:r>
-        <w:t xml:space="preserve"> controla las acciones realizadas diariamente para cumplir con el plan establecido.</w:t>
-      </w:r>
-    </w:p>
-    <w:p>
-      <w:pPr>
-        <w:ind w:firstLine="720"/>
-      </w:pPr>
-      <w:r>
-        <w:t>Este módulo permite llevar un control detallado y eficiente de la nutrición del ganado, asegurando su bienestar y optimizando los recursos del predio.</w:t>
-      </w:r>
-    </w:p>
-    <w:p/>
-    <w:p>
-      <w:r>
-        <w:drawing>
-          <wp:inline distT="0" distB="0" distL="0" distR="0" wp14:anchorId="5B42F726" wp14:editId="65096732">
-            <wp:extent cx="5943600" cy="4836795"/>
-            <wp:effectExtent l="0" t="0" r="0" b="1905"/>
-            <wp:docPr id="142986460" name="Imagen 1"/>
-            <wp:cNvGraphicFramePr>
-              <a:graphicFrameLocks xmlns:a="http://schemas.openxmlformats.org/drawingml/2006/main" noChangeAspect="1"/>
-            </wp:cNvGraphicFramePr>
-            <a:graphic xmlns:a="http://schemas.openxmlformats.org/drawingml/2006/main">
-              <a:graphicData uri="http://schemas.openxmlformats.org/drawingml/2006/picture">
-                <pic:pic xmlns:pic="http://schemas.openxmlformats.org/drawingml/2006/picture">
-                  <pic:nvPicPr>
-                    <pic:cNvPr id="142986460" name=""/>
-                    <pic:cNvPicPr/>
-                  </pic:nvPicPr>
-                  <pic:blipFill>
-                    <a:blip r:embed="rId10"/>
-                    <a:stretch>
-                      <a:fillRect/>
-                    </a:stretch>
-                  </pic:blipFill>
-                  <pic:spPr>
-                    <a:xfrm>
-                      <a:off x="0" y="0"/>
-                      <a:ext cx="5943600" cy="4836795"/>
-                    </a:xfrm>
-                    <a:prstGeom prst="rect">
-                      <a:avLst/>
-                    </a:prstGeom>
-                  </pic:spPr>
-                </pic:pic>
-              </a:graphicData>
-            </a:graphic>
-          </wp:inline>
-        </w:drawing>
-      </w:r>
-    </w:p>
-    <w:p/>
-    <w:p>
-      <w:pPr>
-        <w:pStyle w:val="Ttulo1"/>
-      </w:pPr>
-      <w:r>
-        <w:lastRenderedPageBreak/>
-        <w:t>Conclusión</w:t>
-      </w:r>
-    </w:p>
-    <w:p>
-      <w:pPr>
-        <w:ind w:firstLine="720"/>
-      </w:pPr>
-      <w:r>
-        <w:t xml:space="preserve">Los módulos </w:t>
+        <w:t>contraseña</w:t>
+      </w:r>
+      <w:r>
+        <w:t>.</w:t>
+      </w:r>
+    </w:p>
+    <w:p>
+      <w:pPr>
+        <w:numPr>
+          <w:ilvl w:val="0"/>
+          <w:numId w:val="27"/>
+        </w:numPr>
+      </w:pPr>
+      <w:r>
+        <w:t xml:space="preserve">Validación visual desde el </w:t>
+      </w:r>
+      <w:proofErr w:type="spellStart"/>
+      <w:r>
+        <w:t>Frontend</w:t>
+      </w:r>
+      <w:proofErr w:type="spellEnd"/>
+      <w:r>
+        <w:t>.</w:t>
+      </w:r>
+    </w:p>
+    <w:p>
+      <w:pPr>
+        <w:numPr>
+          <w:ilvl w:val="0"/>
+          <w:numId w:val="27"/>
+        </w:numPr>
+      </w:pPr>
+      <w:r>
+        <w:t xml:space="preserve">Conexión con el </w:t>
+      </w:r>
+      <w:proofErr w:type="spellStart"/>
+      <w:r>
+        <w:t>Backend</w:t>
+      </w:r>
+      <w:proofErr w:type="spellEnd"/>
+      <w:r>
+        <w:t xml:space="preserve"> mediante un archivo PHP encargado de procesar los datos.</w:t>
+      </w:r>
+    </w:p>
+    <w:p>
+      <w:pPr>
+        <w:numPr>
+          <w:ilvl w:val="0"/>
+          <w:numId w:val="27"/>
+        </w:numPr>
+      </w:pPr>
+      <w:r>
+        <w:t>Diseño estilizado y centrado en la experiencia del usuario.</w:t>
+      </w:r>
+    </w:p>
+    <w:p>
+      <w:pPr>
+        <w:numPr>
+          <w:ilvl w:val="0"/>
+          <w:numId w:val="27"/>
+        </w:numPr>
+      </w:pPr>
+      <w:r>
+        <w:t>Preparación del MVC para integrar la autenticación completa.</w:t>
+      </w:r>
+    </w:p>
+    <w:p>
+      <w:r>
+        <w:t xml:space="preserve">Actualmente el formulario envía los datos al </w:t>
+      </w:r>
+      <w:proofErr w:type="spellStart"/>
+      <w:r>
+        <w:t>Backend</w:t>
+      </w:r>
+      <w:proofErr w:type="spellEnd"/>
+      <w:r>
+        <w:t xml:space="preserve">, pero </w:t>
       </w:r>
       <w:r>
         <w:rPr>
           <w:b/>
           <w:bCs/>
         </w:rPr>
-        <w:t>Usuario</w:t>
-      </w:r>
-      <w:r>
-        <w:t xml:space="preserve"> y </w:t>
+        <w:t>aún falta terminar la lógica completa del servidor</w:t>
+      </w:r>
+      <w:r>
+        <w:t>, lo cual corresponde al siguiente ciclo de desarrollo.</w:t>
+      </w:r>
+    </w:p>
+    <w:p>
+      <w:pPr>
+        <w:pStyle w:val="Ttulo2"/>
+      </w:pPr>
+      <w:r>
+        <w:t>1</w:t>
+      </w:r>
+      <w:r>
+        <w:t>.3 D</w:t>
+      </w:r>
+      <w:proofErr w:type="spellStart"/>
+      <w:r>
+        <w:t>ashboard</w:t>
+      </w:r>
+      <w:proofErr w:type="spellEnd"/>
+      <w:r>
+        <w:t xml:space="preserve"> (Tablero de Control)</w:t>
+      </w:r>
+    </w:p>
+    <w:p>
+      <w:r>
+        <w:t xml:space="preserve">El </w:t>
+      </w:r>
+      <w:proofErr w:type="spellStart"/>
+      <w:r>
+        <w:t>Dashboard</w:t>
+      </w:r>
+      <w:proofErr w:type="spellEnd"/>
+      <w:r>
+        <w:t xml:space="preserve"> fue implementado con:</w:t>
+      </w:r>
+    </w:p>
+    <w:p>
+      <w:pPr>
+        <w:numPr>
+          <w:ilvl w:val="0"/>
+          <w:numId w:val="28"/>
+        </w:numPr>
+      </w:pPr>
+      <w:r>
+        <w:t>Estructura HTML organizada por secciones.</w:t>
+      </w:r>
+    </w:p>
+    <w:p>
+      <w:pPr>
+        <w:numPr>
+          <w:ilvl w:val="0"/>
+          <w:numId w:val="28"/>
+        </w:numPr>
+      </w:pPr>
+      <w:r>
+        <w:t>Menús laterales y navegación básica.</w:t>
+      </w:r>
+    </w:p>
+    <w:p>
+      <w:pPr>
+        <w:numPr>
+          <w:ilvl w:val="0"/>
+          <w:numId w:val="28"/>
+        </w:numPr>
+      </w:pPr>
+      <w:r>
+        <w:t>Estilos en CSS para la interfaz.</w:t>
+      </w:r>
+    </w:p>
+    <w:p>
+      <w:pPr>
+        <w:numPr>
+          <w:ilvl w:val="0"/>
+          <w:numId w:val="28"/>
+        </w:numPr>
+      </w:pPr>
+      <w:r>
+        <w:t>Elementos base donde en el futuro se integrarán datos del sistema ganadero.</w:t>
+      </w:r>
+    </w:p>
+    <w:p>
+      <w:pPr>
+        <w:numPr>
+          <w:ilvl w:val="0"/>
+          <w:numId w:val="28"/>
+        </w:numPr>
+      </w:pPr>
+      <w:r>
+        <w:t xml:space="preserve">Plantilla preparada para recibir los datos reales desde el </w:t>
+      </w:r>
+      <w:proofErr w:type="spellStart"/>
+      <w:r>
+        <w:t>Backend</w:t>
+      </w:r>
+      <w:proofErr w:type="spellEnd"/>
+      <w:r>
+        <w:t xml:space="preserve"> en PHP.</w:t>
+      </w:r>
+    </w:p>
+    <w:p>
+      <w:r>
+        <w:t xml:space="preserve">El </w:t>
+      </w:r>
+      <w:proofErr w:type="spellStart"/>
+      <w:r>
+        <w:t>Dashboard</w:t>
+      </w:r>
+      <w:proofErr w:type="spellEnd"/>
+      <w:r>
+        <w:t xml:space="preserve"> todavía no está finalizado a nivel funcional, pero ya cuenta con el diseño visual y la estructura principal donde se integrarán los módulos del sistema.</w:t>
+      </w:r>
+    </w:p>
+    <w:p>
+      <w:pPr>
+        <w:pStyle w:val="Ttulo1"/>
+      </w:pPr>
+      <w:r>
+        <w:lastRenderedPageBreak/>
+        <w:t xml:space="preserve">Integración </w:t>
+      </w:r>
+      <w:proofErr w:type="spellStart"/>
+      <w:r>
+        <w:t>Frontend</w:t>
+      </w:r>
+      <w:proofErr w:type="spellEnd"/>
+      <w:r>
+        <w:t xml:space="preserve"> + </w:t>
+      </w:r>
+      <w:proofErr w:type="spellStart"/>
+      <w:r>
+        <w:t>Backend</w:t>
+      </w:r>
+      <w:proofErr w:type="spellEnd"/>
+    </w:p>
+    <w:p>
+      <w:r>
+        <w:t>En este avance se realizó:</w:t>
+      </w:r>
+    </w:p>
+    <w:p>
+      <w:pPr>
+        <w:numPr>
+          <w:ilvl w:val="0"/>
+          <w:numId w:val="29"/>
+        </w:numPr>
+      </w:pPr>
+      <w:r>
+        <w:t>Unificación de la interfaz visual con los primeros archivos PHP.</w:t>
+      </w:r>
+    </w:p>
+    <w:p>
+      <w:pPr>
+        <w:numPr>
+          <w:ilvl w:val="0"/>
+          <w:numId w:val="29"/>
+        </w:numPr>
+      </w:pPr>
+      <w:r>
+        <w:t xml:space="preserve">Preparación para recibir la lógica completa del </w:t>
+      </w:r>
+      <w:proofErr w:type="spellStart"/>
+      <w:r>
+        <w:t>Backend</w:t>
+      </w:r>
+      <w:proofErr w:type="spellEnd"/>
+      <w:r>
+        <w:t>.</w:t>
+      </w:r>
+    </w:p>
+    <w:p>
+      <w:pPr>
+        <w:numPr>
+          <w:ilvl w:val="0"/>
+          <w:numId w:val="29"/>
+        </w:numPr>
+      </w:pPr>
+      <w:r>
+        <w:t>Enrutamiento básico desde los botones y páginas.</w:t>
+      </w:r>
+    </w:p>
+    <w:p>
+      <w:pPr>
+        <w:numPr>
+          <w:ilvl w:val="0"/>
+          <w:numId w:val="29"/>
+        </w:numPr>
+      </w:pPr>
+      <w:r>
+        <w:t>Implementación del esqueleto MVC.</w:t>
+      </w:r>
+    </w:p>
+    <w:p>
+      <w:r>
+        <w:t>Todo el código visual ya está completamente implementado y funcionando.</w:t>
+      </w:r>
+      <w:r>
+        <w:br/>
       </w:r>
       <w:r>
         <w:rPr>
           <w:b/>
           <w:bCs/>
         </w:rPr>
-        <w:t>Alimentación y Nutrición</w:t>
-      </w:r>
-      <w:r>
-        <w:t xml:space="preserve"> forman parte fundamental del sistema </w:t>
-      </w:r>
+        <w:t xml:space="preserve">La única parte pendiente es completar la programación </w:t>
+      </w:r>
+      <w:proofErr w:type="spellStart"/>
       <w:r>
         <w:rPr>
           <w:b/>
           <w:bCs/>
         </w:rPr>
+        <w:t>Backend</w:t>
+      </w:r>
+      <w:proofErr w:type="spellEnd"/>
+      <w:r>
+        <w:t xml:space="preserve">, especialmente la lógica del </w:t>
+      </w:r>
+      <w:proofErr w:type="spellStart"/>
+      <w:r>
+        <w:t>login</w:t>
+      </w:r>
+      <w:proofErr w:type="spellEnd"/>
+      <w:r>
+        <w:t xml:space="preserve">, manejo de sesiones e integración del </w:t>
+      </w:r>
+      <w:proofErr w:type="spellStart"/>
+      <w:r>
+        <w:t>Dashboard</w:t>
+      </w:r>
+      <w:proofErr w:type="spellEnd"/>
+      <w:r>
+        <w:t xml:space="preserve"> con la base de datos.</w:t>
+      </w:r>
+    </w:p>
+    <w:p>
+      <w:pPr>
+        <w:pStyle w:val="Ttulo1"/>
+      </w:pPr>
+      <w:proofErr w:type="gramStart"/>
+      <w:r>
+        <w:t>L</w:t>
+      </w:r>
+      <w:r>
+        <w:t>ink</w:t>
+      </w:r>
+      <w:proofErr w:type="gramEnd"/>
+      <w:r>
+        <w:t xml:space="preserve"> del repositorio y </w:t>
+      </w:r>
+      <w:r>
+        <w:t>Cómo Ejecutar el Proyecto</w:t>
+      </w:r>
+    </w:p>
+    <w:p>
+      <w:hyperlink r:id="rId9" w:history="1">
+        <w:r>
+          <w:rPr>
+            <w:rStyle w:val="Hipervnculo"/>
+          </w:rPr>
+          <w:t>https://github.com/Jair-Arias/CLASE-NESTOR.git</w:t>
+        </w:r>
+      </w:hyperlink>
+    </w:p>
+    <w:p>
+      <w:r>
+        <w:t xml:space="preserve">Para visualizar y probar el funcionamiento de la Home Page, </w:t>
+      </w:r>
+      <w:proofErr w:type="spellStart"/>
+      <w:r>
+        <w:t>Login</w:t>
+      </w:r>
+      <w:proofErr w:type="spellEnd"/>
+      <w:r>
+        <w:t xml:space="preserve"> y </w:t>
+      </w:r>
+      <w:proofErr w:type="spellStart"/>
+      <w:r>
+        <w:t>Dashboard</w:t>
+      </w:r>
+      <w:proofErr w:type="spellEnd"/>
+      <w:r>
+        <w:t>, basta con:</w:t>
+      </w:r>
+    </w:p>
+    <w:p>
+      <w:pPr>
+        <w:rPr>
+          <w:b/>
+          <w:bCs/>
+        </w:rPr>
+      </w:pPr>
+      <w:r>
+        <w:rPr>
+          <w:b/>
+          <w:bCs/>
+        </w:rPr>
+        <w:t>1. Descargar el proyecto desde el repositorio</w:t>
+      </w:r>
+    </w:p>
+    <w:p>
+      <w:pPr>
+        <w:numPr>
+          <w:ilvl w:val="0"/>
+          <w:numId w:val="30"/>
+        </w:numPr>
+      </w:pPr>
+      <w:r>
+        <w:t>Ingresar al repositorio.</w:t>
+      </w:r>
+    </w:p>
+    <w:p>
+      <w:pPr>
+        <w:numPr>
+          <w:ilvl w:val="0"/>
+          <w:numId w:val="30"/>
+        </w:numPr>
+      </w:pPr>
+      <w:r>
+        <w:t xml:space="preserve">Buscar la carpeta </w:t>
+      </w:r>
+      <w:r>
+        <w:rPr>
+          <w:b/>
+          <w:bCs/>
+        </w:rPr>
+        <w:t>GANACONTROL WEB</w:t>
+      </w:r>
+      <w:r>
+        <w:t>.</w:t>
+      </w:r>
+    </w:p>
+    <w:p>
+      <w:pPr>
+        <w:numPr>
+          <w:ilvl w:val="0"/>
+          <w:numId w:val="30"/>
+        </w:numPr>
+      </w:pPr>
+      <w:r>
+        <w:t>Descargarla en formato ZIP o mediante Git.</w:t>
+      </w:r>
+    </w:p>
+    <w:p>
+      <w:pPr>
+        <w:numPr>
+          <w:ilvl w:val="0"/>
+          <w:numId w:val="30"/>
+        </w:numPr>
+      </w:pPr>
+      <w:r>
+        <w:t>Extraer la carpeta completa.</w:t>
+      </w:r>
+    </w:p>
+    <w:p>
+      <w:pPr>
+        <w:rPr>
+          <w:b/>
+          <w:bCs/>
+        </w:rPr>
+      </w:pPr>
+      <w:r>
+        <w:rPr>
+          <w:b/>
+          <w:bCs/>
+        </w:rPr>
+        <w:t>2. Ejecutar el proyecto</w:t>
+      </w:r>
+    </w:p>
+    <w:p>
+      <w:r>
+        <w:t>No requiere instalación compleja.</w:t>
+      </w:r>
+    </w:p>
+    <w:p>
+      <w:r>
+        <w:t>Solo debes abrir el archivo:</w:t>
+      </w:r>
+    </w:p>
+    <w:p>
+      <w:pPr>
+        <w:rPr>
+          <w:b/>
+          <w:bCs/>
+        </w:rPr>
+      </w:pPr>
+      <w:r>
+        <w:rPr>
+          <w:b/>
+          <w:bCs/>
+        </w:rPr>
+        <w:t>index.html</w:t>
+      </w:r>
+    </w:p>
+    <w:p/>
+    <w:p>
+      <w:r>
+        <w:lastRenderedPageBreak/>
+        <w:t>según tu versión, desde cualquiera de los siguientes:</w:t>
+      </w:r>
+    </w:p>
+    <w:p>
+      <w:pPr>
+        <w:numPr>
+          <w:ilvl w:val="0"/>
+          <w:numId w:val="31"/>
+        </w:numPr>
+      </w:pPr>
+      <w:r>
+        <w:t>Navegador</w:t>
+      </w:r>
+    </w:p>
+    <w:p>
+      <w:pPr>
+        <w:numPr>
+          <w:ilvl w:val="0"/>
+          <w:numId w:val="31"/>
+        </w:numPr>
+      </w:pPr>
+      <w:r>
+        <w:t xml:space="preserve">Live Server (VS </w:t>
+      </w:r>
+      <w:proofErr w:type="spellStart"/>
+      <w:r>
+        <w:t>Code</w:t>
+      </w:r>
+      <w:proofErr w:type="spellEnd"/>
+      <w:r>
+        <w:t>)</w:t>
+      </w:r>
+    </w:p>
+    <w:p>
+      <w:pPr>
+        <w:numPr>
+          <w:ilvl w:val="0"/>
+          <w:numId w:val="31"/>
+        </w:numPr>
+      </w:pPr>
+      <w:r>
+        <w:t>XAMPP si utilizas PHP</w:t>
+      </w:r>
+    </w:p>
+    <w:p>
+      <w:r>
+        <w:t xml:space="preserve">El proyecto cargará automáticamente la Home Page, el </w:t>
+      </w:r>
+      <w:proofErr w:type="spellStart"/>
+      <w:r>
+        <w:t>Login</w:t>
+      </w:r>
+      <w:proofErr w:type="spellEnd"/>
+      <w:r>
+        <w:t xml:space="preserve"> y el </w:t>
+      </w:r>
+      <w:proofErr w:type="spellStart"/>
+      <w:r>
+        <w:t>Dashboard</w:t>
+      </w:r>
+      <w:proofErr w:type="spellEnd"/>
+      <w:r>
+        <w:t>.</w:t>
+      </w:r>
+    </w:p>
+    <w:p>
+      <w:pPr>
+        <w:pStyle w:val="Ttulo1"/>
+      </w:pPr>
+      <w:r>
+        <w:t>Estado Actual del Desarrollo</w:t>
+      </w:r>
+    </w:p>
+    <w:p>
+      <w:r>
+        <w:t>Hasta este punto, se ha completado:</w:t>
+      </w:r>
+    </w:p>
+    <w:p>
+      <w:pPr>
+        <w:numPr>
+          <w:ilvl w:val="0"/>
+          <w:numId w:val="32"/>
+        </w:numPr>
+      </w:pPr>
+      <w:r>
+        <w:t>Home Page totalmente funcional (</w:t>
+      </w:r>
+      <w:proofErr w:type="spellStart"/>
+      <w:r>
+        <w:t>Frontend</w:t>
+      </w:r>
+      <w:proofErr w:type="spellEnd"/>
+      <w:r>
+        <w:t>).</w:t>
+      </w:r>
+    </w:p>
+    <w:p>
+      <w:pPr>
+        <w:numPr>
+          <w:ilvl w:val="0"/>
+          <w:numId w:val="32"/>
+        </w:numPr>
+      </w:pPr>
+      <w:r>
+        <w:t xml:space="preserve">Pantalla de </w:t>
+      </w:r>
+      <w:proofErr w:type="spellStart"/>
+      <w:r>
+        <w:t>Login</w:t>
+      </w:r>
+      <w:proofErr w:type="spellEnd"/>
+      <w:r>
+        <w:t xml:space="preserve"> con diseño y validación visual.</w:t>
+      </w:r>
+    </w:p>
+    <w:p>
+      <w:pPr>
+        <w:numPr>
+          <w:ilvl w:val="0"/>
+          <w:numId w:val="32"/>
+        </w:numPr>
+      </w:pPr>
+      <w:proofErr w:type="spellStart"/>
+      <w:r>
+        <w:t>Dashboard</w:t>
+      </w:r>
+      <w:proofErr w:type="spellEnd"/>
+      <w:r>
+        <w:t xml:space="preserve"> estructural y visual.</w:t>
+      </w:r>
+    </w:p>
+    <w:p>
+      <w:pPr>
+        <w:numPr>
+          <w:ilvl w:val="0"/>
+          <w:numId w:val="32"/>
+        </w:numPr>
+      </w:pPr>
+      <w:r>
+        <w:t xml:space="preserve">Integración básica del </w:t>
+      </w:r>
+      <w:proofErr w:type="spellStart"/>
+      <w:r>
+        <w:t>Backend</w:t>
+      </w:r>
+      <w:proofErr w:type="spellEnd"/>
+      <w:r>
+        <w:t>.</w:t>
+      </w:r>
+    </w:p>
+    <w:p>
+      <w:pPr>
+        <w:rPr>
+          <w:b/>
+          <w:bCs/>
+        </w:rPr>
+      </w:pPr>
+      <w:r>
+        <w:rPr>
+          <w:b/>
+          <w:bCs/>
+        </w:rPr>
+        <w:t>Pendiente por completar</w:t>
+      </w:r>
+    </w:p>
+    <w:p>
+      <w:pPr>
+        <w:numPr>
+          <w:ilvl w:val="0"/>
+          <w:numId w:val="33"/>
+        </w:numPr>
+      </w:pPr>
+      <w:r>
+        <w:t xml:space="preserve">Lógica </w:t>
+      </w:r>
+      <w:proofErr w:type="spellStart"/>
+      <w:r>
+        <w:t>Backend</w:t>
+      </w:r>
+      <w:proofErr w:type="spellEnd"/>
+      <w:r>
+        <w:t xml:space="preserve"> completa en PHP.</w:t>
+      </w:r>
+    </w:p>
+    <w:p>
+      <w:pPr>
+        <w:numPr>
+          <w:ilvl w:val="0"/>
+          <w:numId w:val="33"/>
+        </w:numPr>
+      </w:pPr>
+      <w:r>
+        <w:t>Validación y autenticación real de usuarios.</w:t>
+      </w:r>
+    </w:p>
+    <w:p>
+      <w:pPr>
+        <w:numPr>
+          <w:ilvl w:val="0"/>
+          <w:numId w:val="33"/>
+        </w:numPr>
+      </w:pPr>
+      <w:r>
+        <w:t>Manejo de sesiones.</w:t>
+      </w:r>
+    </w:p>
+    <w:p>
+      <w:pPr>
+        <w:numPr>
+          <w:ilvl w:val="0"/>
+          <w:numId w:val="33"/>
+        </w:numPr>
+      </w:pPr>
+      <w:r>
+        <w:t>Conexión con base de datos.</w:t>
+      </w:r>
+    </w:p>
+    <w:p>
+      <w:pPr>
+        <w:numPr>
+          <w:ilvl w:val="0"/>
+          <w:numId w:val="33"/>
+        </w:numPr>
+      </w:pPr>
+      <w:r>
+        <w:t xml:space="preserve">Integración dinámica de datos en el </w:t>
+      </w:r>
+      <w:proofErr w:type="spellStart"/>
+      <w:r>
+        <w:t>Dashboard</w:t>
+      </w:r>
+      <w:proofErr w:type="spellEnd"/>
+      <w:r>
+        <w:t>.</w:t>
+      </w:r>
+    </w:p>
+    <w:p>
+      <w:pPr>
+        <w:pStyle w:val="Ttulo1"/>
+      </w:pPr>
+      <w:r>
+        <w:t>Conclusión</w:t>
+      </w:r>
+    </w:p>
+    <w:p>
+      <w:r>
+        <w:t xml:space="preserve">La fase de interfaz gráfica del proyecto </w:t>
+      </w:r>
+      <w:proofErr w:type="spellStart"/>
+      <w:r>
         <w:t>GanaControl</w:t>
       </w:r>
-      <w:r>
-        <w:t>. Su desarrollo garantiza la correcta administración de la información y la nutrición del ganado, permitiendo una gestión eficiente y confiable. Estos módulos fueron diseñados y construidos por mí, asegurando la integridad de la información y el cumplimiento de los objetivos del proyecto.</w:t>
-      </w:r>
-    </w:p>
-    <w:p/>
-    <w:p/>
-    <w:p/>
-    <w:p/>
-    <w:p/>
+      <w:proofErr w:type="spellEnd"/>
+      <w:r>
+        <w:t xml:space="preserve"> Web se encuentra casi terminada.</w:t>
+      </w:r>
+      <w:r>
+        <w:br/>
+        <w:t xml:space="preserve">La Home Page, </w:t>
+      </w:r>
+      <w:proofErr w:type="spellStart"/>
+      <w:r>
+        <w:t>Login</w:t>
+      </w:r>
+      <w:proofErr w:type="spellEnd"/>
+      <w:r>
+        <w:t xml:space="preserve"> y </w:t>
+      </w:r>
+      <w:proofErr w:type="spellStart"/>
+      <w:r>
+        <w:t>Dashboard</w:t>
+      </w:r>
+      <w:proofErr w:type="spellEnd"/>
+      <w:r>
+        <w:t xml:space="preserve"> están implementados correctamente y unificados dentro del </w:t>
+      </w:r>
+      <w:r>
+        <w:lastRenderedPageBreak/>
+        <w:t xml:space="preserve">proyecto. El trabajo siguiente se centrará en completar el </w:t>
+      </w:r>
+      <w:proofErr w:type="spellStart"/>
+      <w:r>
+        <w:t>Backend</w:t>
+      </w:r>
+      <w:proofErr w:type="spellEnd"/>
+      <w:r>
+        <w:t xml:space="preserve"> en PHP y conectar los módulos con la base de datos para obtener el sistema completamente funcional.</w:t>
+      </w:r>
+    </w:p>
     <w:p/>
     <w:p/>
     <w:sectPr>
-      <w:headerReference w:type="default" r:id="rId11"/>
-      <w:footerReference w:type="default" r:id="rId12"/>
+      <w:headerReference w:type="default" r:id="rId10"/>
+      <w:footerReference w:type="default" r:id="rId11"/>
       <w:pgSz w:w="12240" w:h="15840"/>
       <w:pgMar w:top="1440" w:right="1440" w:bottom="1440" w:left="1440" w:header="720" w:footer="720" w:gutter="0"/>
       <w:pgNumType w:start="0"/>
@@ -1221,6 +1946,155 @@
     </w:lvl>
   </w:abstractNum>
   <w:abstractNum w:abstractNumId="4" w15:restartNumberingAfterBreak="0">
+    <w:nsid w:val="0B0B55AA"/>
+    <w:multiLevelType w:val="multilevel"/>
+    <w:tmpl w:val="262A89DE"/>
+    <w:lvl w:ilvl="0">
+      <w:start w:val="1"/>
+      <w:numFmt w:val="bullet"/>
+      <w:lvlText w:val=""/>
+      <w:lvlJc w:val="left"/>
+      <w:pPr>
+        <w:tabs>
+          <w:tab w:val="num" w:pos="720"/>
+        </w:tabs>
+        <w:ind w:left="720" w:hanging="360"/>
+      </w:pPr>
+      <w:rPr>
+        <w:rFonts w:ascii="Symbol" w:hAnsi="Symbol" w:hint="default"/>
+        <w:sz w:val="20"/>
+      </w:rPr>
+    </w:lvl>
+    <w:lvl w:ilvl="1" w:tentative="1">
+      <w:start w:val="1"/>
+      <w:numFmt w:val="bullet"/>
+      <w:lvlText w:val="o"/>
+      <w:lvlJc w:val="left"/>
+      <w:pPr>
+        <w:tabs>
+          <w:tab w:val="num" w:pos="1440"/>
+        </w:tabs>
+        <w:ind w:left="1440" w:hanging="360"/>
+      </w:pPr>
+      <w:rPr>
+        <w:rFonts w:ascii="Courier New" w:hAnsi="Courier New" w:hint="default"/>
+        <w:sz w:val="20"/>
+      </w:rPr>
+    </w:lvl>
+    <w:lvl w:ilvl="2" w:tentative="1">
+      <w:start w:val="1"/>
+      <w:numFmt w:val="bullet"/>
+      <w:lvlText w:val=""/>
+      <w:lvlJc w:val="left"/>
+      <w:pPr>
+        <w:tabs>
+          <w:tab w:val="num" w:pos="2160"/>
+        </w:tabs>
+        <w:ind w:left="2160" w:hanging="360"/>
+      </w:pPr>
+      <w:rPr>
+        <w:rFonts w:ascii="Wingdings" w:hAnsi="Wingdings" w:hint="default"/>
+        <w:sz w:val="20"/>
+      </w:rPr>
+    </w:lvl>
+    <w:lvl w:ilvl="3" w:tentative="1">
+      <w:start w:val="1"/>
+      <w:numFmt w:val="bullet"/>
+      <w:lvlText w:val=""/>
+      <w:lvlJc w:val="left"/>
+      <w:pPr>
+        <w:tabs>
+          <w:tab w:val="num" w:pos="2880"/>
+        </w:tabs>
+        <w:ind w:left="2880" w:hanging="360"/>
+      </w:pPr>
+      <w:rPr>
+        <w:rFonts w:ascii="Wingdings" w:hAnsi="Wingdings" w:hint="default"/>
+        <w:sz w:val="20"/>
+      </w:rPr>
+    </w:lvl>
+    <w:lvl w:ilvl="4" w:tentative="1">
+      <w:start w:val="1"/>
+      <w:numFmt w:val="bullet"/>
+      <w:lvlText w:val=""/>
+      <w:lvlJc w:val="left"/>
+      <w:pPr>
+        <w:tabs>
+          <w:tab w:val="num" w:pos="3600"/>
+        </w:tabs>
+        <w:ind w:left="3600" w:hanging="360"/>
+      </w:pPr>
+      <w:rPr>
+        <w:rFonts w:ascii="Wingdings" w:hAnsi="Wingdings" w:hint="default"/>
+        <w:sz w:val="20"/>
+      </w:rPr>
+    </w:lvl>
+    <w:lvl w:ilvl="5" w:tentative="1">
+      <w:start w:val="1"/>
+      <w:numFmt w:val="bullet"/>
+      <w:lvlText w:val=""/>
+      <w:lvlJc w:val="left"/>
+      <w:pPr>
+        <w:tabs>
+          <w:tab w:val="num" w:pos="4320"/>
+        </w:tabs>
+        <w:ind w:left="4320" w:hanging="360"/>
+      </w:pPr>
+      <w:rPr>
+        <w:rFonts w:ascii="Wingdings" w:hAnsi="Wingdings" w:hint="default"/>
+        <w:sz w:val="20"/>
+      </w:rPr>
+    </w:lvl>
+    <w:lvl w:ilvl="6" w:tentative="1">
+      <w:start w:val="1"/>
+      <w:numFmt w:val="bullet"/>
+      <w:lvlText w:val=""/>
+      <w:lvlJc w:val="left"/>
+      <w:pPr>
+        <w:tabs>
+          <w:tab w:val="num" w:pos="5040"/>
+        </w:tabs>
+        <w:ind w:left="5040" w:hanging="360"/>
+      </w:pPr>
+      <w:rPr>
+        <w:rFonts w:ascii="Wingdings" w:hAnsi="Wingdings" w:hint="default"/>
+        <w:sz w:val="20"/>
+      </w:rPr>
+    </w:lvl>
+    <w:lvl w:ilvl="7" w:tentative="1">
+      <w:start w:val="1"/>
+      <w:numFmt w:val="bullet"/>
+      <w:lvlText w:val=""/>
+      <w:lvlJc w:val="left"/>
+      <w:pPr>
+        <w:tabs>
+          <w:tab w:val="num" w:pos="5760"/>
+        </w:tabs>
+        <w:ind w:left="5760" w:hanging="360"/>
+      </w:pPr>
+      <w:rPr>
+        <w:rFonts w:ascii="Wingdings" w:hAnsi="Wingdings" w:hint="default"/>
+        <w:sz w:val="20"/>
+      </w:rPr>
+    </w:lvl>
+    <w:lvl w:ilvl="8" w:tentative="1">
+      <w:start w:val="1"/>
+      <w:numFmt w:val="bullet"/>
+      <w:lvlText w:val=""/>
+      <w:lvlJc w:val="left"/>
+      <w:pPr>
+        <w:tabs>
+          <w:tab w:val="num" w:pos="6480"/>
+        </w:tabs>
+        <w:ind w:left="6480" w:hanging="360"/>
+      </w:pPr>
+      <w:rPr>
+        <w:rFonts w:ascii="Wingdings" w:hAnsi="Wingdings" w:hint="default"/>
+        <w:sz w:val="20"/>
+      </w:rPr>
+    </w:lvl>
+  </w:abstractNum>
+  <w:abstractNum w:abstractNumId="5" w15:restartNumberingAfterBreak="0">
     <w:nsid w:val="0F86394D"/>
     <w:multiLevelType w:val="hybridMultilevel"/>
     <w:tmpl w:val="6C128788"/>
@@ -1333,7 +2207,7 @@
       </w:rPr>
     </w:lvl>
   </w:abstractNum>
-  <w:abstractNum w:abstractNumId="5" w15:restartNumberingAfterBreak="0">
+  <w:abstractNum w:abstractNumId="6" w15:restartNumberingAfterBreak="0">
     <w:nsid w:val="16754322"/>
     <w:multiLevelType w:val="multilevel"/>
     <w:tmpl w:val="82F80BA6"/>
@@ -1482,7 +2356,7 @@
       </w:rPr>
     </w:lvl>
   </w:abstractNum>
-  <w:abstractNum w:abstractNumId="6" w15:restartNumberingAfterBreak="0">
+  <w:abstractNum w:abstractNumId="7" w15:restartNumberingAfterBreak="0">
     <w:nsid w:val="170A1D9A"/>
     <w:multiLevelType w:val="multilevel"/>
     <w:tmpl w:val="AF942F5A"/>
@@ -1631,7 +2505,7 @@
       </w:rPr>
     </w:lvl>
   </w:abstractNum>
-  <w:abstractNum w:abstractNumId="7" w15:restartNumberingAfterBreak="0">
+  <w:abstractNum w:abstractNumId="8" w15:restartNumberingAfterBreak="0">
     <w:nsid w:val="185F2B6E"/>
     <w:multiLevelType w:val="multilevel"/>
     <w:tmpl w:val="D1507CE2"/>
@@ -1744,7 +2618,7 @@
       </w:pPr>
     </w:lvl>
   </w:abstractNum>
-  <w:abstractNum w:abstractNumId="8" w15:restartNumberingAfterBreak="0">
+  <w:abstractNum w:abstractNumId="9" w15:restartNumberingAfterBreak="0">
     <w:nsid w:val="1E0011FE"/>
     <w:multiLevelType w:val="hybridMultilevel"/>
     <w:tmpl w:val="FE20D2B6"/>
@@ -1833,7 +2707,7 @@
       </w:pPr>
     </w:lvl>
   </w:abstractNum>
-  <w:abstractNum w:abstractNumId="9" w15:restartNumberingAfterBreak="0">
+  <w:abstractNum w:abstractNumId="10" w15:restartNumberingAfterBreak="0">
     <w:nsid w:val="213E7071"/>
     <w:multiLevelType w:val="multilevel"/>
     <w:tmpl w:val="042EBC1E"/>
@@ -1982,7 +2856,156 @@
       </w:rPr>
     </w:lvl>
   </w:abstractNum>
-  <w:abstractNum w:abstractNumId="10" w15:restartNumberingAfterBreak="0">
+  <w:abstractNum w:abstractNumId="11" w15:restartNumberingAfterBreak="0">
+    <w:nsid w:val="25C53FA7"/>
+    <w:multiLevelType w:val="multilevel"/>
+    <w:tmpl w:val="334EA276"/>
+    <w:lvl w:ilvl="0">
+      <w:start w:val="1"/>
+      <w:numFmt w:val="bullet"/>
+      <w:lvlText w:val=""/>
+      <w:lvlJc w:val="left"/>
+      <w:pPr>
+        <w:tabs>
+          <w:tab w:val="num" w:pos="720"/>
+        </w:tabs>
+        <w:ind w:left="720" w:hanging="360"/>
+      </w:pPr>
+      <w:rPr>
+        <w:rFonts w:ascii="Symbol" w:hAnsi="Symbol" w:hint="default"/>
+        <w:sz w:val="20"/>
+      </w:rPr>
+    </w:lvl>
+    <w:lvl w:ilvl="1" w:tentative="1">
+      <w:start w:val="1"/>
+      <w:numFmt w:val="bullet"/>
+      <w:lvlText w:val="o"/>
+      <w:lvlJc w:val="left"/>
+      <w:pPr>
+        <w:tabs>
+          <w:tab w:val="num" w:pos="1440"/>
+        </w:tabs>
+        <w:ind w:left="1440" w:hanging="360"/>
+      </w:pPr>
+      <w:rPr>
+        <w:rFonts w:ascii="Courier New" w:hAnsi="Courier New" w:hint="default"/>
+        <w:sz w:val="20"/>
+      </w:rPr>
+    </w:lvl>
+    <w:lvl w:ilvl="2" w:tentative="1">
+      <w:start w:val="1"/>
+      <w:numFmt w:val="bullet"/>
+      <w:lvlText w:val=""/>
+      <w:lvlJc w:val="left"/>
+      <w:pPr>
+        <w:tabs>
+          <w:tab w:val="num" w:pos="2160"/>
+        </w:tabs>
+        <w:ind w:left="2160" w:hanging="360"/>
+      </w:pPr>
+      <w:rPr>
+        <w:rFonts w:ascii="Wingdings" w:hAnsi="Wingdings" w:hint="default"/>
+        <w:sz w:val="20"/>
+      </w:rPr>
+    </w:lvl>
+    <w:lvl w:ilvl="3" w:tentative="1">
+      <w:start w:val="1"/>
+      <w:numFmt w:val="bullet"/>
+      <w:lvlText w:val=""/>
+      <w:lvlJc w:val="left"/>
+      <w:pPr>
+        <w:tabs>
+          <w:tab w:val="num" w:pos="2880"/>
+        </w:tabs>
+        <w:ind w:left="2880" w:hanging="360"/>
+      </w:pPr>
+      <w:rPr>
+        <w:rFonts w:ascii="Wingdings" w:hAnsi="Wingdings" w:hint="default"/>
+        <w:sz w:val="20"/>
+      </w:rPr>
+    </w:lvl>
+    <w:lvl w:ilvl="4" w:tentative="1">
+      <w:start w:val="1"/>
+      <w:numFmt w:val="bullet"/>
+      <w:lvlText w:val=""/>
+      <w:lvlJc w:val="left"/>
+      <w:pPr>
+        <w:tabs>
+          <w:tab w:val="num" w:pos="3600"/>
+        </w:tabs>
+        <w:ind w:left="3600" w:hanging="360"/>
+      </w:pPr>
+      <w:rPr>
+        <w:rFonts w:ascii="Wingdings" w:hAnsi="Wingdings" w:hint="default"/>
+        <w:sz w:val="20"/>
+      </w:rPr>
+    </w:lvl>
+    <w:lvl w:ilvl="5" w:tentative="1">
+      <w:start w:val="1"/>
+      <w:numFmt w:val="bullet"/>
+      <w:lvlText w:val=""/>
+      <w:lvlJc w:val="left"/>
+      <w:pPr>
+        <w:tabs>
+          <w:tab w:val="num" w:pos="4320"/>
+        </w:tabs>
+        <w:ind w:left="4320" w:hanging="360"/>
+      </w:pPr>
+      <w:rPr>
+        <w:rFonts w:ascii="Wingdings" w:hAnsi="Wingdings" w:hint="default"/>
+        <w:sz w:val="20"/>
+      </w:rPr>
+    </w:lvl>
+    <w:lvl w:ilvl="6" w:tentative="1">
+      <w:start w:val="1"/>
+      <w:numFmt w:val="bullet"/>
+      <w:lvlText w:val=""/>
+      <w:lvlJc w:val="left"/>
+      <w:pPr>
+        <w:tabs>
+          <w:tab w:val="num" w:pos="5040"/>
+        </w:tabs>
+        <w:ind w:left="5040" w:hanging="360"/>
+      </w:pPr>
+      <w:rPr>
+        <w:rFonts w:ascii="Wingdings" w:hAnsi="Wingdings" w:hint="default"/>
+        <w:sz w:val="20"/>
+      </w:rPr>
+    </w:lvl>
+    <w:lvl w:ilvl="7" w:tentative="1">
+      <w:start w:val="1"/>
+      <w:numFmt w:val="bullet"/>
+      <w:lvlText w:val=""/>
+      <w:lvlJc w:val="left"/>
+      <w:pPr>
+        <w:tabs>
+          <w:tab w:val="num" w:pos="5760"/>
+        </w:tabs>
+        <w:ind w:left="5760" w:hanging="360"/>
+      </w:pPr>
+      <w:rPr>
+        <w:rFonts w:ascii="Wingdings" w:hAnsi="Wingdings" w:hint="default"/>
+        <w:sz w:val="20"/>
+      </w:rPr>
+    </w:lvl>
+    <w:lvl w:ilvl="8" w:tentative="1">
+      <w:start w:val="1"/>
+      <w:numFmt w:val="bullet"/>
+      <w:lvlText w:val=""/>
+      <w:lvlJc w:val="left"/>
+      <w:pPr>
+        <w:tabs>
+          <w:tab w:val="num" w:pos="6480"/>
+        </w:tabs>
+        <w:ind w:left="6480" w:hanging="360"/>
+      </w:pPr>
+      <w:rPr>
+        <w:rFonts w:ascii="Wingdings" w:hAnsi="Wingdings" w:hint="default"/>
+        <w:sz w:val="20"/>
+      </w:rPr>
+    </w:lvl>
+  </w:abstractNum>
+  <w:abstractNum w:abstractNumId="12" w15:restartNumberingAfterBreak="0">
     <w:nsid w:val="38066D0E"/>
     <w:multiLevelType w:val="multilevel"/>
     <w:tmpl w:val="FD74E74E"/>
@@ -2131,7 +3154,7 @@
       </w:rPr>
     </w:lvl>
   </w:abstractNum>
-  <w:abstractNum w:abstractNumId="11" w15:restartNumberingAfterBreak="0">
+  <w:abstractNum w:abstractNumId="13" w15:restartNumberingAfterBreak="0">
     <w:nsid w:val="3D0E133A"/>
     <w:multiLevelType w:val="multilevel"/>
     <w:tmpl w:val="8EB2B9A2"/>
@@ -2244,7 +3267,7 @@
       </w:pPr>
     </w:lvl>
   </w:abstractNum>
-  <w:abstractNum w:abstractNumId="12" w15:restartNumberingAfterBreak="0">
+  <w:abstractNum w:abstractNumId="14" w15:restartNumberingAfterBreak="0">
     <w:nsid w:val="3DB50C05"/>
     <w:multiLevelType w:val="multilevel"/>
     <w:tmpl w:val="870AFDDA"/>
@@ -2357,7 +3380,156 @@
       </w:pPr>
     </w:lvl>
   </w:abstractNum>
-  <w:abstractNum w:abstractNumId="13" w15:restartNumberingAfterBreak="0">
+  <w:abstractNum w:abstractNumId="15" w15:restartNumberingAfterBreak="0">
+    <w:nsid w:val="3E1E4D02"/>
+    <w:multiLevelType w:val="multilevel"/>
+    <w:tmpl w:val="379E32F6"/>
+    <w:lvl w:ilvl="0">
+      <w:start w:val="1"/>
+      <w:numFmt w:val="bullet"/>
+      <w:lvlText w:val=""/>
+      <w:lvlJc w:val="left"/>
+      <w:pPr>
+        <w:tabs>
+          <w:tab w:val="num" w:pos="720"/>
+        </w:tabs>
+        <w:ind w:left="720" w:hanging="360"/>
+      </w:pPr>
+      <w:rPr>
+        <w:rFonts w:ascii="Symbol" w:hAnsi="Symbol" w:hint="default"/>
+        <w:sz w:val="20"/>
+      </w:rPr>
+    </w:lvl>
+    <w:lvl w:ilvl="1" w:tentative="1">
+      <w:start w:val="1"/>
+      <w:numFmt w:val="bullet"/>
+      <w:lvlText w:val="o"/>
+      <w:lvlJc w:val="left"/>
+      <w:pPr>
+        <w:tabs>
+          <w:tab w:val="num" w:pos="1440"/>
+        </w:tabs>
+        <w:ind w:left="1440" w:hanging="360"/>
+      </w:pPr>
+      <w:rPr>
+        <w:rFonts w:ascii="Courier New" w:hAnsi="Courier New" w:hint="default"/>
+        <w:sz w:val="20"/>
+      </w:rPr>
+    </w:lvl>
+    <w:lvl w:ilvl="2" w:tentative="1">
+      <w:start w:val="1"/>
+      <w:numFmt w:val="bullet"/>
+      <w:lvlText w:val=""/>
+      <w:lvlJc w:val="left"/>
+      <w:pPr>
+        <w:tabs>
+          <w:tab w:val="num" w:pos="2160"/>
+        </w:tabs>
+        <w:ind w:left="2160" w:hanging="360"/>
+      </w:pPr>
+      <w:rPr>
+        <w:rFonts w:ascii="Wingdings" w:hAnsi="Wingdings" w:hint="default"/>
+        <w:sz w:val="20"/>
+      </w:rPr>
+    </w:lvl>
+    <w:lvl w:ilvl="3" w:tentative="1">
+      <w:start w:val="1"/>
+      <w:numFmt w:val="bullet"/>
+      <w:lvlText w:val=""/>
+      <w:lvlJc w:val="left"/>
+      <w:pPr>
+        <w:tabs>
+          <w:tab w:val="num" w:pos="2880"/>
+        </w:tabs>
+        <w:ind w:left="2880" w:hanging="360"/>
+      </w:pPr>
+      <w:rPr>
+        <w:rFonts w:ascii="Wingdings" w:hAnsi="Wingdings" w:hint="default"/>
+        <w:sz w:val="20"/>
+      </w:rPr>
+    </w:lvl>
+    <w:lvl w:ilvl="4" w:tentative="1">
+      <w:start w:val="1"/>
+      <w:numFmt w:val="bullet"/>
+      <w:lvlText w:val=""/>
+      <w:lvlJc w:val="left"/>
+      <w:pPr>
+        <w:tabs>
+          <w:tab w:val="num" w:pos="3600"/>
+        </w:tabs>
+        <w:ind w:left="3600" w:hanging="360"/>
+      </w:pPr>
+      <w:rPr>
+        <w:rFonts w:ascii="Wingdings" w:hAnsi="Wingdings" w:hint="default"/>
+        <w:sz w:val="20"/>
+      </w:rPr>
+    </w:lvl>
+    <w:lvl w:ilvl="5" w:tentative="1">
+      <w:start w:val="1"/>
+      <w:numFmt w:val="bullet"/>
+      <w:lvlText w:val=""/>
+      <w:lvlJc w:val="left"/>
+      <w:pPr>
+        <w:tabs>
+          <w:tab w:val="num" w:pos="4320"/>
+        </w:tabs>
+        <w:ind w:left="4320" w:hanging="360"/>
+      </w:pPr>
+      <w:rPr>
+        <w:rFonts w:ascii="Wingdings" w:hAnsi="Wingdings" w:hint="default"/>
+        <w:sz w:val="20"/>
+      </w:rPr>
+    </w:lvl>
+    <w:lvl w:ilvl="6" w:tentative="1">
+      <w:start w:val="1"/>
+      <w:numFmt w:val="bullet"/>
+      <w:lvlText w:val=""/>
+      <w:lvlJc w:val="left"/>
+      <w:pPr>
+        <w:tabs>
+          <w:tab w:val="num" w:pos="5040"/>
+        </w:tabs>
+        <w:ind w:left="5040" w:hanging="360"/>
+      </w:pPr>
+      <w:rPr>
+        <w:rFonts w:ascii="Wingdings" w:hAnsi="Wingdings" w:hint="default"/>
+        <w:sz w:val="20"/>
+      </w:rPr>
+    </w:lvl>
+    <w:lvl w:ilvl="7" w:tentative="1">
+      <w:start w:val="1"/>
+      <w:numFmt w:val="bullet"/>
+      <w:lvlText w:val=""/>
+      <w:lvlJc w:val="left"/>
+      <w:pPr>
+        <w:tabs>
+          <w:tab w:val="num" w:pos="5760"/>
+        </w:tabs>
+        <w:ind w:left="5760" w:hanging="360"/>
+      </w:pPr>
+      <w:rPr>
+        <w:rFonts w:ascii="Wingdings" w:hAnsi="Wingdings" w:hint="default"/>
+        <w:sz w:val="20"/>
+      </w:rPr>
+    </w:lvl>
+    <w:lvl w:ilvl="8" w:tentative="1">
+      <w:start w:val="1"/>
+      <w:numFmt w:val="bullet"/>
+      <w:lvlText w:val=""/>
+      <w:lvlJc w:val="left"/>
+      <w:pPr>
+        <w:tabs>
+          <w:tab w:val="num" w:pos="6480"/>
+        </w:tabs>
+        <w:ind w:left="6480" w:hanging="360"/>
+      </w:pPr>
+      <w:rPr>
+        <w:rFonts w:ascii="Wingdings" w:hAnsi="Wingdings" w:hint="default"/>
+        <w:sz w:val="20"/>
+      </w:rPr>
+    </w:lvl>
+  </w:abstractNum>
+  <w:abstractNum w:abstractNumId="16" w15:restartNumberingAfterBreak="0">
     <w:nsid w:val="3E4357BB"/>
     <w:multiLevelType w:val="hybridMultilevel"/>
     <w:tmpl w:val="C64CDB08"/>
@@ -2470,7 +3642,305 @@
       </w:rPr>
     </w:lvl>
   </w:abstractNum>
-  <w:abstractNum w:abstractNumId="14" w15:restartNumberingAfterBreak="0">
+  <w:abstractNum w:abstractNumId="17" w15:restartNumberingAfterBreak="0">
+    <w:nsid w:val="42E05FA3"/>
+    <w:multiLevelType w:val="multilevel"/>
+    <w:tmpl w:val="5C0ED7AE"/>
+    <w:lvl w:ilvl="0">
+      <w:start w:val="1"/>
+      <w:numFmt w:val="bullet"/>
+      <w:lvlText w:val=""/>
+      <w:lvlJc w:val="left"/>
+      <w:pPr>
+        <w:tabs>
+          <w:tab w:val="num" w:pos="720"/>
+        </w:tabs>
+        <w:ind w:left="720" w:hanging="360"/>
+      </w:pPr>
+      <w:rPr>
+        <w:rFonts w:ascii="Symbol" w:hAnsi="Symbol" w:hint="default"/>
+        <w:sz w:val="20"/>
+      </w:rPr>
+    </w:lvl>
+    <w:lvl w:ilvl="1" w:tentative="1">
+      <w:start w:val="1"/>
+      <w:numFmt w:val="bullet"/>
+      <w:lvlText w:val="o"/>
+      <w:lvlJc w:val="left"/>
+      <w:pPr>
+        <w:tabs>
+          <w:tab w:val="num" w:pos="1440"/>
+        </w:tabs>
+        <w:ind w:left="1440" w:hanging="360"/>
+      </w:pPr>
+      <w:rPr>
+        <w:rFonts w:ascii="Courier New" w:hAnsi="Courier New" w:hint="default"/>
+        <w:sz w:val="20"/>
+      </w:rPr>
+    </w:lvl>
+    <w:lvl w:ilvl="2" w:tentative="1">
+      <w:start w:val="1"/>
+      <w:numFmt w:val="bullet"/>
+      <w:lvlText w:val=""/>
+      <w:lvlJc w:val="left"/>
+      <w:pPr>
+        <w:tabs>
+          <w:tab w:val="num" w:pos="2160"/>
+        </w:tabs>
+        <w:ind w:left="2160" w:hanging="360"/>
+      </w:pPr>
+      <w:rPr>
+        <w:rFonts w:ascii="Wingdings" w:hAnsi="Wingdings" w:hint="default"/>
+        <w:sz w:val="20"/>
+      </w:rPr>
+    </w:lvl>
+    <w:lvl w:ilvl="3" w:tentative="1">
+      <w:start w:val="1"/>
+      <w:numFmt w:val="bullet"/>
+      <w:lvlText w:val=""/>
+      <w:lvlJc w:val="left"/>
+      <w:pPr>
+        <w:tabs>
+          <w:tab w:val="num" w:pos="2880"/>
+        </w:tabs>
+        <w:ind w:left="2880" w:hanging="360"/>
+      </w:pPr>
+      <w:rPr>
+        <w:rFonts w:ascii="Wingdings" w:hAnsi="Wingdings" w:hint="default"/>
+        <w:sz w:val="20"/>
+      </w:rPr>
+    </w:lvl>
+    <w:lvl w:ilvl="4" w:tentative="1">
+      <w:start w:val="1"/>
+      <w:numFmt w:val="bullet"/>
+      <w:lvlText w:val=""/>
+      <w:lvlJc w:val="left"/>
+      <w:pPr>
+        <w:tabs>
+          <w:tab w:val="num" w:pos="3600"/>
+        </w:tabs>
+        <w:ind w:left="3600" w:hanging="360"/>
+      </w:pPr>
+      <w:rPr>
+        <w:rFonts w:ascii="Wingdings" w:hAnsi="Wingdings" w:hint="default"/>
+        <w:sz w:val="20"/>
+      </w:rPr>
+    </w:lvl>
+    <w:lvl w:ilvl="5" w:tentative="1">
+      <w:start w:val="1"/>
+      <w:numFmt w:val="bullet"/>
+      <w:lvlText w:val=""/>
+      <w:lvlJc w:val="left"/>
+      <w:pPr>
+        <w:tabs>
+          <w:tab w:val="num" w:pos="4320"/>
+        </w:tabs>
+        <w:ind w:left="4320" w:hanging="360"/>
+      </w:pPr>
+      <w:rPr>
+        <w:rFonts w:ascii="Wingdings" w:hAnsi="Wingdings" w:hint="default"/>
+        <w:sz w:val="20"/>
+      </w:rPr>
+    </w:lvl>
+    <w:lvl w:ilvl="6" w:tentative="1">
+      <w:start w:val="1"/>
+      <w:numFmt w:val="bullet"/>
+      <w:lvlText w:val=""/>
+      <w:lvlJc w:val="left"/>
+      <w:pPr>
+        <w:tabs>
+          <w:tab w:val="num" w:pos="5040"/>
+        </w:tabs>
+        <w:ind w:left="5040" w:hanging="360"/>
+      </w:pPr>
+      <w:rPr>
+        <w:rFonts w:ascii="Wingdings" w:hAnsi="Wingdings" w:hint="default"/>
+        <w:sz w:val="20"/>
+      </w:rPr>
+    </w:lvl>
+    <w:lvl w:ilvl="7" w:tentative="1">
+      <w:start w:val="1"/>
+      <w:numFmt w:val="bullet"/>
+      <w:lvlText w:val=""/>
+      <w:lvlJc w:val="left"/>
+      <w:pPr>
+        <w:tabs>
+          <w:tab w:val="num" w:pos="5760"/>
+        </w:tabs>
+        <w:ind w:left="5760" w:hanging="360"/>
+      </w:pPr>
+      <w:rPr>
+        <w:rFonts w:ascii="Wingdings" w:hAnsi="Wingdings" w:hint="default"/>
+        <w:sz w:val="20"/>
+      </w:rPr>
+    </w:lvl>
+    <w:lvl w:ilvl="8" w:tentative="1">
+      <w:start w:val="1"/>
+      <w:numFmt w:val="bullet"/>
+      <w:lvlText w:val=""/>
+      <w:lvlJc w:val="left"/>
+      <w:pPr>
+        <w:tabs>
+          <w:tab w:val="num" w:pos="6480"/>
+        </w:tabs>
+        <w:ind w:left="6480" w:hanging="360"/>
+      </w:pPr>
+      <w:rPr>
+        <w:rFonts w:ascii="Wingdings" w:hAnsi="Wingdings" w:hint="default"/>
+        <w:sz w:val="20"/>
+      </w:rPr>
+    </w:lvl>
+  </w:abstractNum>
+  <w:abstractNum w:abstractNumId="18" w15:restartNumberingAfterBreak="0">
+    <w:nsid w:val="464808C1"/>
+    <w:multiLevelType w:val="multilevel"/>
+    <w:tmpl w:val="0C741B18"/>
+    <w:lvl w:ilvl="0">
+      <w:start w:val="1"/>
+      <w:numFmt w:val="bullet"/>
+      <w:lvlText w:val=""/>
+      <w:lvlJc w:val="left"/>
+      <w:pPr>
+        <w:tabs>
+          <w:tab w:val="num" w:pos="720"/>
+        </w:tabs>
+        <w:ind w:left="720" w:hanging="360"/>
+      </w:pPr>
+      <w:rPr>
+        <w:rFonts w:ascii="Symbol" w:hAnsi="Symbol" w:hint="default"/>
+        <w:sz w:val="20"/>
+      </w:rPr>
+    </w:lvl>
+    <w:lvl w:ilvl="1" w:tentative="1">
+      <w:start w:val="1"/>
+      <w:numFmt w:val="bullet"/>
+      <w:lvlText w:val="o"/>
+      <w:lvlJc w:val="left"/>
+      <w:pPr>
+        <w:tabs>
+          <w:tab w:val="num" w:pos="1440"/>
+        </w:tabs>
+        <w:ind w:left="1440" w:hanging="360"/>
+      </w:pPr>
+      <w:rPr>
+        <w:rFonts w:ascii="Courier New" w:hAnsi="Courier New" w:hint="default"/>
+        <w:sz w:val="20"/>
+      </w:rPr>
+    </w:lvl>
+    <w:lvl w:ilvl="2" w:tentative="1">
+      <w:start w:val="1"/>
+      <w:numFmt w:val="bullet"/>
+      <w:lvlText w:val=""/>
+      <w:lvlJc w:val="left"/>
+      <w:pPr>
+        <w:tabs>
+          <w:tab w:val="num" w:pos="2160"/>
+        </w:tabs>
+        <w:ind w:left="2160" w:hanging="360"/>
+      </w:pPr>
+      <w:rPr>
+        <w:rFonts w:ascii="Wingdings" w:hAnsi="Wingdings" w:hint="default"/>
+        <w:sz w:val="20"/>
+      </w:rPr>
+    </w:lvl>
+    <w:lvl w:ilvl="3" w:tentative="1">
+      <w:start w:val="1"/>
+      <w:numFmt w:val="bullet"/>
+      <w:lvlText w:val=""/>
+      <w:lvlJc w:val="left"/>
+      <w:pPr>
+        <w:tabs>
+          <w:tab w:val="num" w:pos="2880"/>
+        </w:tabs>
+        <w:ind w:left="2880" w:hanging="360"/>
+      </w:pPr>
+      <w:rPr>
+        <w:rFonts w:ascii="Wingdings" w:hAnsi="Wingdings" w:hint="default"/>
+        <w:sz w:val="20"/>
+      </w:rPr>
+    </w:lvl>
+    <w:lvl w:ilvl="4" w:tentative="1">
+      <w:start w:val="1"/>
+      <w:numFmt w:val="bullet"/>
+      <w:lvlText w:val=""/>
+      <w:lvlJc w:val="left"/>
+      <w:pPr>
+        <w:tabs>
+          <w:tab w:val="num" w:pos="3600"/>
+        </w:tabs>
+        <w:ind w:left="3600" w:hanging="360"/>
+      </w:pPr>
+      <w:rPr>
+        <w:rFonts w:ascii="Wingdings" w:hAnsi="Wingdings" w:hint="default"/>
+        <w:sz w:val="20"/>
+      </w:rPr>
+    </w:lvl>
+    <w:lvl w:ilvl="5" w:tentative="1">
+      <w:start w:val="1"/>
+      <w:numFmt w:val="bullet"/>
+      <w:lvlText w:val=""/>
+      <w:lvlJc w:val="left"/>
+      <w:pPr>
+        <w:tabs>
+          <w:tab w:val="num" w:pos="4320"/>
+        </w:tabs>
+        <w:ind w:left="4320" w:hanging="360"/>
+      </w:pPr>
+      <w:rPr>
+        <w:rFonts w:ascii="Wingdings" w:hAnsi="Wingdings" w:hint="default"/>
+        <w:sz w:val="20"/>
+      </w:rPr>
+    </w:lvl>
+    <w:lvl w:ilvl="6" w:tentative="1">
+      <w:start w:val="1"/>
+      <w:numFmt w:val="bullet"/>
+      <w:lvlText w:val=""/>
+      <w:lvlJc w:val="left"/>
+      <w:pPr>
+        <w:tabs>
+          <w:tab w:val="num" w:pos="5040"/>
+        </w:tabs>
+        <w:ind w:left="5040" w:hanging="360"/>
+      </w:pPr>
+      <w:rPr>
+        <w:rFonts w:ascii="Wingdings" w:hAnsi="Wingdings" w:hint="default"/>
+        <w:sz w:val="20"/>
+      </w:rPr>
+    </w:lvl>
+    <w:lvl w:ilvl="7" w:tentative="1">
+      <w:start w:val="1"/>
+      <w:numFmt w:val="bullet"/>
+      <w:lvlText w:val=""/>
+      <w:lvlJc w:val="left"/>
+      <w:pPr>
+        <w:tabs>
+          <w:tab w:val="num" w:pos="5760"/>
+        </w:tabs>
+        <w:ind w:left="5760" w:hanging="360"/>
+      </w:pPr>
+      <w:rPr>
+        <w:rFonts w:ascii="Wingdings" w:hAnsi="Wingdings" w:hint="default"/>
+        <w:sz w:val="20"/>
+      </w:rPr>
+    </w:lvl>
+    <w:lvl w:ilvl="8" w:tentative="1">
+      <w:start w:val="1"/>
+      <w:numFmt w:val="bullet"/>
+      <w:lvlText w:val=""/>
+      <w:lvlJc w:val="left"/>
+      <w:pPr>
+        <w:tabs>
+          <w:tab w:val="num" w:pos="6480"/>
+        </w:tabs>
+        <w:ind w:left="6480" w:hanging="360"/>
+      </w:pPr>
+      <w:rPr>
+        <w:rFonts w:ascii="Wingdings" w:hAnsi="Wingdings" w:hint="default"/>
+        <w:sz w:val="20"/>
+      </w:rPr>
+    </w:lvl>
+  </w:abstractNum>
+  <w:abstractNum w:abstractNumId="19" w15:restartNumberingAfterBreak="0">
     <w:nsid w:val="4ACA676C"/>
     <w:multiLevelType w:val="multilevel"/>
     <w:tmpl w:val="C21EA758"/>
@@ -2619,7 +4089,7 @@
       </w:rPr>
     </w:lvl>
   </w:abstractNum>
-  <w:abstractNum w:abstractNumId="15" w15:restartNumberingAfterBreak="0">
+  <w:abstractNum w:abstractNumId="20" w15:restartNumberingAfterBreak="0">
     <w:nsid w:val="50F5196E"/>
     <w:multiLevelType w:val="hybridMultilevel"/>
     <w:tmpl w:val="C4CA2B0E"/>
@@ -2709,7 +4179,7 @@
       </w:pPr>
     </w:lvl>
   </w:abstractNum>
-  <w:abstractNum w:abstractNumId="16" w15:restartNumberingAfterBreak="0">
+  <w:abstractNum w:abstractNumId="21" w15:restartNumberingAfterBreak="0">
     <w:nsid w:val="59A67A6A"/>
     <w:multiLevelType w:val="multilevel"/>
     <w:tmpl w:val="F58A3BB4"/>
@@ -2826,7 +4296,156 @@
       </w:pPr>
     </w:lvl>
   </w:abstractNum>
-  <w:abstractNum w:abstractNumId="17" w15:restartNumberingAfterBreak="0">
+  <w:abstractNum w:abstractNumId="22" w15:restartNumberingAfterBreak="0">
+    <w:nsid w:val="59B6770D"/>
+    <w:multiLevelType w:val="multilevel"/>
+    <w:tmpl w:val="EEB06138"/>
+    <w:lvl w:ilvl="0">
+      <w:start w:val="1"/>
+      <w:numFmt w:val="bullet"/>
+      <w:lvlText w:val=""/>
+      <w:lvlJc w:val="left"/>
+      <w:pPr>
+        <w:tabs>
+          <w:tab w:val="num" w:pos="720"/>
+        </w:tabs>
+        <w:ind w:left="720" w:hanging="360"/>
+      </w:pPr>
+      <w:rPr>
+        <w:rFonts w:ascii="Symbol" w:hAnsi="Symbol" w:hint="default"/>
+        <w:sz w:val="20"/>
+      </w:rPr>
+    </w:lvl>
+    <w:lvl w:ilvl="1" w:tentative="1">
+      <w:start w:val="1"/>
+      <w:numFmt w:val="bullet"/>
+      <w:lvlText w:val="o"/>
+      <w:lvlJc w:val="left"/>
+      <w:pPr>
+        <w:tabs>
+          <w:tab w:val="num" w:pos="1440"/>
+        </w:tabs>
+        <w:ind w:left="1440" w:hanging="360"/>
+      </w:pPr>
+      <w:rPr>
+        <w:rFonts w:ascii="Courier New" w:hAnsi="Courier New" w:hint="default"/>
+        <w:sz w:val="20"/>
+      </w:rPr>
+    </w:lvl>
+    <w:lvl w:ilvl="2" w:tentative="1">
+      <w:start w:val="1"/>
+      <w:numFmt w:val="bullet"/>
+      <w:lvlText w:val=""/>
+      <w:lvlJc w:val="left"/>
+      <w:pPr>
+        <w:tabs>
+          <w:tab w:val="num" w:pos="2160"/>
+        </w:tabs>
+        <w:ind w:left="2160" w:hanging="360"/>
+      </w:pPr>
+      <w:rPr>
+        <w:rFonts w:ascii="Wingdings" w:hAnsi="Wingdings" w:hint="default"/>
+        <w:sz w:val="20"/>
+      </w:rPr>
+    </w:lvl>
+    <w:lvl w:ilvl="3" w:tentative="1">
+      <w:start w:val="1"/>
+      <w:numFmt w:val="bullet"/>
+      <w:lvlText w:val=""/>
+      <w:lvlJc w:val="left"/>
+      <w:pPr>
+        <w:tabs>
+          <w:tab w:val="num" w:pos="2880"/>
+        </w:tabs>
+        <w:ind w:left="2880" w:hanging="360"/>
+      </w:pPr>
+      <w:rPr>
+        <w:rFonts w:ascii="Wingdings" w:hAnsi="Wingdings" w:hint="default"/>
+        <w:sz w:val="20"/>
+      </w:rPr>
+    </w:lvl>
+    <w:lvl w:ilvl="4" w:tentative="1">
+      <w:start w:val="1"/>
+      <w:numFmt w:val="bullet"/>
+      <w:lvlText w:val=""/>
+      <w:lvlJc w:val="left"/>
+      <w:pPr>
+        <w:tabs>
+          <w:tab w:val="num" w:pos="3600"/>
+        </w:tabs>
+        <w:ind w:left="3600" w:hanging="360"/>
+      </w:pPr>
+      <w:rPr>
+        <w:rFonts w:ascii="Wingdings" w:hAnsi="Wingdings" w:hint="default"/>
+        <w:sz w:val="20"/>
+      </w:rPr>
+    </w:lvl>
+    <w:lvl w:ilvl="5" w:tentative="1">
+      <w:start w:val="1"/>
+      <w:numFmt w:val="bullet"/>
+      <w:lvlText w:val=""/>
+      <w:lvlJc w:val="left"/>
+      <w:pPr>
+        <w:tabs>
+          <w:tab w:val="num" w:pos="4320"/>
+        </w:tabs>
+        <w:ind w:left="4320" w:hanging="360"/>
+      </w:pPr>
+      <w:rPr>
+        <w:rFonts w:ascii="Wingdings" w:hAnsi="Wingdings" w:hint="default"/>
+        <w:sz w:val="20"/>
+      </w:rPr>
+    </w:lvl>
+    <w:lvl w:ilvl="6" w:tentative="1">
+      <w:start w:val="1"/>
+      <w:numFmt w:val="bullet"/>
+      <w:lvlText w:val=""/>
+      <w:lvlJc w:val="left"/>
+      <w:pPr>
+        <w:tabs>
+          <w:tab w:val="num" w:pos="5040"/>
+        </w:tabs>
+        <w:ind w:left="5040" w:hanging="360"/>
+      </w:pPr>
+      <w:rPr>
+        <w:rFonts w:ascii="Wingdings" w:hAnsi="Wingdings" w:hint="default"/>
+        <w:sz w:val="20"/>
+      </w:rPr>
+    </w:lvl>
+    <w:lvl w:ilvl="7" w:tentative="1">
+      <w:start w:val="1"/>
+      <w:numFmt w:val="bullet"/>
+      <w:lvlText w:val=""/>
+      <w:lvlJc w:val="left"/>
+      <w:pPr>
+        <w:tabs>
+          <w:tab w:val="num" w:pos="5760"/>
+        </w:tabs>
+        <w:ind w:left="5760" w:hanging="360"/>
+      </w:pPr>
+      <w:rPr>
+        <w:rFonts w:ascii="Wingdings" w:hAnsi="Wingdings" w:hint="default"/>
+        <w:sz w:val="20"/>
+      </w:rPr>
+    </w:lvl>
+    <w:lvl w:ilvl="8" w:tentative="1">
+      <w:start w:val="1"/>
+      <w:numFmt w:val="bullet"/>
+      <w:lvlText w:val=""/>
+      <w:lvlJc w:val="left"/>
+      <w:pPr>
+        <w:tabs>
+          <w:tab w:val="num" w:pos="6480"/>
+        </w:tabs>
+        <w:ind w:left="6480" w:hanging="360"/>
+      </w:pPr>
+      <w:rPr>
+        <w:rFonts w:ascii="Wingdings" w:hAnsi="Wingdings" w:hint="default"/>
+        <w:sz w:val="20"/>
+      </w:rPr>
+    </w:lvl>
+  </w:abstractNum>
+  <w:abstractNum w:abstractNumId="23" w15:restartNumberingAfterBreak="0">
     <w:nsid w:val="61DD2385"/>
     <w:multiLevelType w:val="multilevel"/>
     <w:tmpl w:val="9F74D4C0"/>
@@ -2939,7 +4558,156 @@
       </w:pPr>
     </w:lvl>
   </w:abstractNum>
-  <w:abstractNum w:abstractNumId="18" w15:restartNumberingAfterBreak="0">
+  <w:abstractNum w:abstractNumId="24" w15:restartNumberingAfterBreak="0">
+    <w:nsid w:val="6B9044F7"/>
+    <w:multiLevelType w:val="multilevel"/>
+    <w:tmpl w:val="D8605E44"/>
+    <w:lvl w:ilvl="0">
+      <w:start w:val="1"/>
+      <w:numFmt w:val="bullet"/>
+      <w:lvlText w:val=""/>
+      <w:lvlJc w:val="left"/>
+      <w:pPr>
+        <w:tabs>
+          <w:tab w:val="num" w:pos="720"/>
+        </w:tabs>
+        <w:ind w:left="720" w:hanging="360"/>
+      </w:pPr>
+      <w:rPr>
+        <w:rFonts w:ascii="Symbol" w:hAnsi="Symbol" w:hint="default"/>
+        <w:sz w:val="20"/>
+      </w:rPr>
+    </w:lvl>
+    <w:lvl w:ilvl="1" w:tentative="1">
+      <w:start w:val="1"/>
+      <w:numFmt w:val="bullet"/>
+      <w:lvlText w:val="o"/>
+      <w:lvlJc w:val="left"/>
+      <w:pPr>
+        <w:tabs>
+          <w:tab w:val="num" w:pos="1440"/>
+        </w:tabs>
+        <w:ind w:left="1440" w:hanging="360"/>
+      </w:pPr>
+      <w:rPr>
+        <w:rFonts w:ascii="Courier New" w:hAnsi="Courier New" w:hint="default"/>
+        <w:sz w:val="20"/>
+      </w:rPr>
+    </w:lvl>
+    <w:lvl w:ilvl="2" w:tentative="1">
+      <w:start w:val="1"/>
+      <w:numFmt w:val="bullet"/>
+      <w:lvlText w:val=""/>
+      <w:lvlJc w:val="left"/>
+      <w:pPr>
+        <w:tabs>
+          <w:tab w:val="num" w:pos="2160"/>
+        </w:tabs>
+        <w:ind w:left="2160" w:hanging="360"/>
+      </w:pPr>
+      <w:rPr>
+        <w:rFonts w:ascii="Wingdings" w:hAnsi="Wingdings" w:hint="default"/>
+        <w:sz w:val="20"/>
+      </w:rPr>
+    </w:lvl>
+    <w:lvl w:ilvl="3" w:tentative="1">
+      <w:start w:val="1"/>
+      <w:numFmt w:val="bullet"/>
+      <w:lvlText w:val=""/>
+      <w:lvlJc w:val="left"/>
+      <w:pPr>
+        <w:tabs>
+          <w:tab w:val="num" w:pos="2880"/>
+        </w:tabs>
+        <w:ind w:left="2880" w:hanging="360"/>
+      </w:pPr>
+      <w:rPr>
+        <w:rFonts w:ascii="Wingdings" w:hAnsi="Wingdings" w:hint="default"/>
+        <w:sz w:val="20"/>
+      </w:rPr>
+    </w:lvl>
+    <w:lvl w:ilvl="4" w:tentative="1">
+      <w:start w:val="1"/>
+      <w:numFmt w:val="bullet"/>
+      <w:lvlText w:val=""/>
+      <w:lvlJc w:val="left"/>
+      <w:pPr>
+        <w:tabs>
+          <w:tab w:val="num" w:pos="3600"/>
+        </w:tabs>
+        <w:ind w:left="3600" w:hanging="360"/>
+      </w:pPr>
+      <w:rPr>
+        <w:rFonts w:ascii="Wingdings" w:hAnsi="Wingdings" w:hint="default"/>
+        <w:sz w:val="20"/>
+      </w:rPr>
+    </w:lvl>
+    <w:lvl w:ilvl="5" w:tentative="1">
+      <w:start w:val="1"/>
+      <w:numFmt w:val="bullet"/>
+      <w:lvlText w:val=""/>
+      <w:lvlJc w:val="left"/>
+      <w:pPr>
+        <w:tabs>
+          <w:tab w:val="num" w:pos="4320"/>
+        </w:tabs>
+        <w:ind w:left="4320" w:hanging="360"/>
+      </w:pPr>
+      <w:rPr>
+        <w:rFonts w:ascii="Wingdings" w:hAnsi="Wingdings" w:hint="default"/>
+        <w:sz w:val="20"/>
+      </w:rPr>
+    </w:lvl>
+    <w:lvl w:ilvl="6" w:tentative="1">
+      <w:start w:val="1"/>
+      <w:numFmt w:val="bullet"/>
+      <w:lvlText w:val=""/>
+      <w:lvlJc w:val="left"/>
+      <w:pPr>
+        <w:tabs>
+          <w:tab w:val="num" w:pos="5040"/>
+        </w:tabs>
+        <w:ind w:left="5040" w:hanging="360"/>
+      </w:pPr>
+      <w:rPr>
+        <w:rFonts w:ascii="Wingdings" w:hAnsi="Wingdings" w:hint="default"/>
+        <w:sz w:val="20"/>
+      </w:rPr>
+    </w:lvl>
+    <w:lvl w:ilvl="7" w:tentative="1">
+      <w:start w:val="1"/>
+      <w:numFmt w:val="bullet"/>
+      <w:lvlText w:val=""/>
+      <w:lvlJc w:val="left"/>
+      <w:pPr>
+        <w:tabs>
+          <w:tab w:val="num" w:pos="5760"/>
+        </w:tabs>
+        <w:ind w:left="5760" w:hanging="360"/>
+      </w:pPr>
+      <w:rPr>
+        <w:rFonts w:ascii="Wingdings" w:hAnsi="Wingdings" w:hint="default"/>
+        <w:sz w:val="20"/>
+      </w:rPr>
+    </w:lvl>
+    <w:lvl w:ilvl="8" w:tentative="1">
+      <w:start w:val="1"/>
+      <w:numFmt w:val="bullet"/>
+      <w:lvlText w:val=""/>
+      <w:lvlJc w:val="left"/>
+      <w:pPr>
+        <w:tabs>
+          <w:tab w:val="num" w:pos="6480"/>
+        </w:tabs>
+        <w:ind w:left="6480" w:hanging="360"/>
+      </w:pPr>
+      <w:rPr>
+        <w:rFonts w:ascii="Wingdings" w:hAnsi="Wingdings" w:hint="default"/>
+        <w:sz w:val="20"/>
+      </w:rPr>
+    </w:lvl>
+  </w:abstractNum>
+  <w:abstractNum w:abstractNumId="25" w15:restartNumberingAfterBreak="0">
     <w:nsid w:val="6C9729BB"/>
     <w:multiLevelType w:val="multilevel"/>
     <w:tmpl w:val="46F6CB8E"/>
@@ -3088,7 +4856,7 @@
       </w:rPr>
     </w:lvl>
   </w:abstractNum>
-  <w:abstractNum w:abstractNumId="19" w15:restartNumberingAfterBreak="0">
+  <w:abstractNum w:abstractNumId="26" w15:restartNumberingAfterBreak="0">
     <w:nsid w:val="6EEA44CF"/>
     <w:multiLevelType w:val="multilevel"/>
     <w:tmpl w:val="1D186DC2"/>
@@ -3237,7 +5005,7 @@
       </w:rPr>
     </w:lvl>
   </w:abstractNum>
-  <w:abstractNum w:abstractNumId="20" w15:restartNumberingAfterBreak="0">
+  <w:abstractNum w:abstractNumId="27" w15:restartNumberingAfterBreak="0">
     <w:nsid w:val="70222B09"/>
     <w:multiLevelType w:val="multilevel"/>
     <w:tmpl w:val="63482326"/>
@@ -3350,7 +5118,156 @@
       </w:pPr>
     </w:lvl>
   </w:abstractNum>
-  <w:abstractNum w:abstractNumId="21" w15:restartNumberingAfterBreak="0">
+  <w:abstractNum w:abstractNumId="28" w15:restartNumberingAfterBreak="0">
+    <w:nsid w:val="73432A86"/>
+    <w:multiLevelType w:val="multilevel"/>
+    <w:tmpl w:val="4322EADA"/>
+    <w:lvl w:ilvl="0">
+      <w:start w:val="1"/>
+      <w:numFmt w:val="bullet"/>
+      <w:lvlText w:val=""/>
+      <w:lvlJc w:val="left"/>
+      <w:pPr>
+        <w:tabs>
+          <w:tab w:val="num" w:pos="720"/>
+        </w:tabs>
+        <w:ind w:left="720" w:hanging="360"/>
+      </w:pPr>
+      <w:rPr>
+        <w:rFonts w:ascii="Symbol" w:hAnsi="Symbol" w:hint="default"/>
+        <w:sz w:val="20"/>
+      </w:rPr>
+    </w:lvl>
+    <w:lvl w:ilvl="1" w:tentative="1">
+      <w:start w:val="1"/>
+      <w:numFmt w:val="bullet"/>
+      <w:lvlText w:val="o"/>
+      <w:lvlJc w:val="left"/>
+      <w:pPr>
+        <w:tabs>
+          <w:tab w:val="num" w:pos="1440"/>
+        </w:tabs>
+        <w:ind w:left="1440" w:hanging="360"/>
+      </w:pPr>
+      <w:rPr>
+        <w:rFonts w:ascii="Courier New" w:hAnsi="Courier New" w:hint="default"/>
+        <w:sz w:val="20"/>
+      </w:rPr>
+    </w:lvl>
+    <w:lvl w:ilvl="2" w:tentative="1">
+      <w:start w:val="1"/>
+      <w:numFmt w:val="bullet"/>
+      <w:lvlText w:val=""/>
+      <w:lvlJc w:val="left"/>
+      <w:pPr>
+        <w:tabs>
+          <w:tab w:val="num" w:pos="2160"/>
+        </w:tabs>
+        <w:ind w:left="2160" w:hanging="360"/>
+      </w:pPr>
+      <w:rPr>
+        <w:rFonts w:ascii="Wingdings" w:hAnsi="Wingdings" w:hint="default"/>
+        <w:sz w:val="20"/>
+      </w:rPr>
+    </w:lvl>
+    <w:lvl w:ilvl="3" w:tentative="1">
+      <w:start w:val="1"/>
+      <w:numFmt w:val="bullet"/>
+      <w:lvlText w:val=""/>
+      <w:lvlJc w:val="left"/>
+      <w:pPr>
+        <w:tabs>
+          <w:tab w:val="num" w:pos="2880"/>
+        </w:tabs>
+        <w:ind w:left="2880" w:hanging="360"/>
+      </w:pPr>
+      <w:rPr>
+        <w:rFonts w:ascii="Wingdings" w:hAnsi="Wingdings" w:hint="default"/>
+        <w:sz w:val="20"/>
+      </w:rPr>
+    </w:lvl>
+    <w:lvl w:ilvl="4" w:tentative="1">
+      <w:start w:val="1"/>
+      <w:numFmt w:val="bullet"/>
+      <w:lvlText w:val=""/>
+      <w:lvlJc w:val="left"/>
+      <w:pPr>
+        <w:tabs>
+          <w:tab w:val="num" w:pos="3600"/>
+        </w:tabs>
+        <w:ind w:left="3600" w:hanging="360"/>
+      </w:pPr>
+      <w:rPr>
+        <w:rFonts w:ascii="Wingdings" w:hAnsi="Wingdings" w:hint="default"/>
+        <w:sz w:val="20"/>
+      </w:rPr>
+    </w:lvl>
+    <w:lvl w:ilvl="5" w:tentative="1">
+      <w:start w:val="1"/>
+      <w:numFmt w:val="bullet"/>
+      <w:lvlText w:val=""/>
+      <w:lvlJc w:val="left"/>
+      <w:pPr>
+        <w:tabs>
+          <w:tab w:val="num" w:pos="4320"/>
+        </w:tabs>
+        <w:ind w:left="4320" w:hanging="360"/>
+      </w:pPr>
+      <w:rPr>
+        <w:rFonts w:ascii="Wingdings" w:hAnsi="Wingdings" w:hint="default"/>
+        <w:sz w:val="20"/>
+      </w:rPr>
+    </w:lvl>
+    <w:lvl w:ilvl="6" w:tentative="1">
+      <w:start w:val="1"/>
+      <w:numFmt w:val="bullet"/>
+      <w:lvlText w:val=""/>
+      <w:lvlJc w:val="left"/>
+      <w:pPr>
+        <w:tabs>
+          <w:tab w:val="num" w:pos="5040"/>
+        </w:tabs>
+        <w:ind w:left="5040" w:hanging="360"/>
+      </w:pPr>
+      <w:rPr>
+        <w:rFonts w:ascii="Wingdings" w:hAnsi="Wingdings" w:hint="default"/>
+        <w:sz w:val="20"/>
+      </w:rPr>
+    </w:lvl>
+    <w:lvl w:ilvl="7" w:tentative="1">
+      <w:start w:val="1"/>
+      <w:numFmt w:val="bullet"/>
+      <w:lvlText w:val=""/>
+      <w:lvlJc w:val="left"/>
+      <w:pPr>
+        <w:tabs>
+          <w:tab w:val="num" w:pos="5760"/>
+        </w:tabs>
+        <w:ind w:left="5760" w:hanging="360"/>
+      </w:pPr>
+      <w:rPr>
+        <w:rFonts w:ascii="Wingdings" w:hAnsi="Wingdings" w:hint="default"/>
+        <w:sz w:val="20"/>
+      </w:rPr>
+    </w:lvl>
+    <w:lvl w:ilvl="8" w:tentative="1">
+      <w:start w:val="1"/>
+      <w:numFmt w:val="bullet"/>
+      <w:lvlText w:val=""/>
+      <w:lvlJc w:val="left"/>
+      <w:pPr>
+        <w:tabs>
+          <w:tab w:val="num" w:pos="6480"/>
+        </w:tabs>
+        <w:ind w:left="6480" w:hanging="360"/>
+      </w:pPr>
+      <w:rPr>
+        <w:rFonts w:ascii="Wingdings" w:hAnsi="Wingdings" w:hint="default"/>
+        <w:sz w:val="20"/>
+      </w:rPr>
+    </w:lvl>
+  </w:abstractNum>
+  <w:abstractNum w:abstractNumId="29" w15:restartNumberingAfterBreak="0">
     <w:nsid w:val="7481558F"/>
     <w:multiLevelType w:val="multilevel"/>
     <w:tmpl w:val="51B4E424"/>
@@ -3499,7 +5416,7 @@
       </w:rPr>
     </w:lvl>
   </w:abstractNum>
-  <w:abstractNum w:abstractNumId="22" w15:restartNumberingAfterBreak="0">
+  <w:abstractNum w:abstractNumId="30" w15:restartNumberingAfterBreak="0">
     <w:nsid w:val="7D24113A"/>
     <w:multiLevelType w:val="hybridMultilevel"/>
     <w:tmpl w:val="83140B1E"/>
@@ -3588,7 +5505,7 @@
       </w:pPr>
     </w:lvl>
   </w:abstractNum>
-  <w:abstractNum w:abstractNumId="23" w15:restartNumberingAfterBreak="0">
+  <w:abstractNum w:abstractNumId="31" w15:restartNumberingAfterBreak="0">
     <w:nsid w:val="7D771A3C"/>
     <w:multiLevelType w:val="multilevel"/>
     <w:tmpl w:val="2DBE4920"/>
@@ -3737,7 +5654,7 @@
       </w:rPr>
     </w:lvl>
   </w:abstractNum>
-  <w:abstractNum w:abstractNumId="24" w15:restartNumberingAfterBreak="0">
+  <w:abstractNum w:abstractNumId="32" w15:restartNumberingAfterBreak="0">
     <w:nsid w:val="7F897BEC"/>
     <w:multiLevelType w:val="hybridMultilevel"/>
     <w:tmpl w:val="53E83E7A"/>
@@ -3827,43 +5744,43 @@
     </w:lvl>
   </w:abstractNum>
   <w:num w:numId="1" w16cid:durableId="358745787">
-    <w:abstractNumId w:val="11"/>
+    <w:abstractNumId w:val="13"/>
   </w:num>
   <w:num w:numId="2" w16cid:durableId="668677464">
-    <w:abstractNumId w:val="12"/>
+    <w:abstractNumId w:val="14"/>
   </w:num>
   <w:num w:numId="3" w16cid:durableId="1054963083">
-    <w:abstractNumId w:val="4"/>
+    <w:abstractNumId w:val="5"/>
   </w:num>
   <w:num w:numId="4" w16cid:durableId="1671061294">
-    <w:abstractNumId w:val="22"/>
+    <w:abstractNumId w:val="30"/>
   </w:num>
   <w:num w:numId="5" w16cid:durableId="224684202">
     <w:abstractNumId w:val="3"/>
   </w:num>
   <w:num w:numId="6" w16cid:durableId="1886673902">
-    <w:abstractNumId w:val="13"/>
+    <w:abstractNumId w:val="16"/>
   </w:num>
   <w:num w:numId="7" w16cid:durableId="2102674627">
-    <w:abstractNumId w:val="24"/>
+    <w:abstractNumId w:val="32"/>
   </w:num>
   <w:num w:numId="8" w16cid:durableId="1704359959">
-    <w:abstractNumId w:val="16"/>
+    <w:abstractNumId w:val="21"/>
   </w:num>
   <w:num w:numId="9" w16cid:durableId="140736742">
-    <w:abstractNumId w:val="19"/>
+    <w:abstractNumId w:val="26"/>
   </w:num>
   <w:num w:numId="10" w16cid:durableId="732898086">
-    <w:abstractNumId w:val="17"/>
+    <w:abstractNumId w:val="23"/>
   </w:num>
   <w:num w:numId="11" w16cid:durableId="2039701554">
-    <w:abstractNumId w:val="6"/>
+    <w:abstractNumId w:val="7"/>
   </w:num>
   <w:num w:numId="12" w16cid:durableId="1073089100">
-    <w:abstractNumId w:val="7"/>
+    <w:abstractNumId w:val="8"/>
   </w:num>
   <w:num w:numId="13" w16cid:durableId="450249585">
-    <w:abstractNumId w:val="10"/>
+    <w:abstractNumId w:val="12"/>
   </w:num>
   <w:num w:numId="14" w16cid:durableId="2077969599">
     <w:abstractNumId w:val="0"/>
@@ -3875,31 +5792,55 @@
     <w:abstractNumId w:val="2"/>
   </w:num>
   <w:num w:numId="17" w16cid:durableId="723721517">
-    <w:abstractNumId w:val="14"/>
+    <w:abstractNumId w:val="19"/>
   </w:num>
   <w:num w:numId="18" w16cid:durableId="1944221706">
+    <w:abstractNumId w:val="27"/>
+  </w:num>
+  <w:num w:numId="19" w16cid:durableId="2050060419">
+    <w:abstractNumId w:val="29"/>
+  </w:num>
+  <w:num w:numId="20" w16cid:durableId="633216489">
+    <w:abstractNumId w:val="9"/>
+  </w:num>
+  <w:num w:numId="21" w16cid:durableId="878131194">
+    <w:abstractNumId w:val="10"/>
+  </w:num>
+  <w:num w:numId="22" w16cid:durableId="1791317214">
     <w:abstractNumId w:val="20"/>
   </w:num>
-  <w:num w:numId="19" w16cid:durableId="2050060419">
-    <w:abstractNumId w:val="21"/>
-  </w:num>
-  <w:num w:numId="20" w16cid:durableId="633216489">
-    <w:abstractNumId w:val="8"/>
-  </w:num>
-  <w:num w:numId="21" w16cid:durableId="878131194">
-    <w:abstractNumId w:val="9"/>
-  </w:num>
-  <w:num w:numId="22" w16cid:durableId="1791317214">
-    <w:abstractNumId w:val="15"/>
-  </w:num>
   <w:num w:numId="23" w16cid:durableId="453523644">
-    <w:abstractNumId w:val="5"/>
+    <w:abstractNumId w:val="6"/>
   </w:num>
   <w:num w:numId="24" w16cid:durableId="1797486775">
-    <w:abstractNumId w:val="23"/>
+    <w:abstractNumId w:val="31"/>
   </w:num>
   <w:num w:numId="25" w16cid:durableId="1284919293">
+    <w:abstractNumId w:val="25"/>
+  </w:num>
+  <w:num w:numId="26" w16cid:durableId="226649342">
+    <w:abstractNumId w:val="22"/>
+  </w:num>
+  <w:num w:numId="27" w16cid:durableId="2123915804">
+    <w:abstractNumId w:val="11"/>
+  </w:num>
+  <w:num w:numId="28" w16cid:durableId="1138258606">
+    <w:abstractNumId w:val="4"/>
+  </w:num>
+  <w:num w:numId="29" w16cid:durableId="1623069496">
+    <w:abstractNumId w:val="17"/>
+  </w:num>
+  <w:num w:numId="30" w16cid:durableId="732891914">
+    <w:abstractNumId w:val="28"/>
+  </w:num>
+  <w:num w:numId="31" w16cid:durableId="1621492789">
     <w:abstractNumId w:val="18"/>
+  </w:num>
+  <w:num w:numId="32" w16cid:durableId="1825079109">
+    <w:abstractNumId w:val="24"/>
+  </w:num>
+  <w:num w:numId="33" w16cid:durableId="899560336">
+    <w:abstractNumId w:val="15"/>
   </w:num>
 </w:numbering>
 </file>
@@ -4995,28 +6936,28 @@
 </file>
 
 <file path=customXml/item1.xml><?xml version="1.0" encoding="utf-8"?>
+<b:Sources xmlns:b="http://schemas.openxmlformats.org/officeDocument/2006/bibliography" xmlns="http://schemas.openxmlformats.org/officeDocument/2006/bibliography" SelectedStyle="\APASixthEditionOfficeOnline.xsl" StyleName="APA" Version="6"/>
+</file>
+
+<file path=customXml/item2.xml><?xml version="1.0" encoding="utf-8"?>
 <go:gDocsCustomXmlDataStorage xmlns:go="http://customooxmlschemas.google.com/" xmlns:r="http://schemas.openxmlformats.org/officeDocument/2006/relationships" uri="GoogleDocsCustomDataVersion2">
   <go:docsCustomData xmlns:go="http://customooxmlschemas.google.com/" roundtripDataSignature="AMtx7mgjIi8mV/ll7RC7RGGXrONUlBLqNw==">CgMxLjAyDmgubjZ6NWc0dTI2b2kzMg5oLm9mYTFhemt2NXJhbTIOaC45YXdpd2prZWp5YmMyDmguaWwwMTZiMnQzYXMzMg5oLjY3eXl2dTdkdmFuYTgAciExbk1zQVJYN1ZyVTR2b0Joc1hRSmY1enRLM2JXWVhrZDU=</go:docsCustomData>
 </go:gDocsCustomXmlDataStorage>
 </file>
 
-<file path=customXml/item2.xml><?xml version="1.0" encoding="utf-8"?>
-<b:Sources xmlns:b="http://schemas.openxmlformats.org/officeDocument/2006/bibliography" xmlns="http://schemas.openxmlformats.org/officeDocument/2006/bibliography" SelectedStyle="\APASixthEditionOfficeOnline.xsl" StyleName="APA" Version="6"/>
+<file path=customXml/itemProps1.xml><?xml version="1.0" encoding="utf-8"?>
+<ds:datastoreItem xmlns:ds="http://schemas.openxmlformats.org/officeDocument/2006/customXml" ds:itemID="{2EC9EC03-D02E-4056-A37D-CA6E9DCD92DB}">
+  <ds:schemaRefs>
+    <ds:schemaRef ds:uri="http://schemas.openxmlformats.org/officeDocument/2006/bibliography"/>
+  </ds:schemaRefs>
+</ds:datastoreItem>
 </file>
 
-<file path=customXml/itemProps1.xml><?xml version="1.0" encoding="utf-8"?>
+<file path=customXml/itemProps2.xml><?xml version="1.0" encoding="utf-8"?>
 <ds:datastoreItem xmlns:ds="http://schemas.openxmlformats.org/officeDocument/2006/customXml" ds:itemID="{11111111-1234-1234-1234-123412341234}">
   <ds:schemaRefs>
     <ds:schemaRef ds:uri="http://customooxmlschemas.google.com/"/>
     <ds:schemaRef ds:uri="http://schemas.openxmlformats.org/officeDocument/2006/relationships"/>
   </ds:schemaRefs>
 </ds:datastoreItem>
-</file>
-
-<file path=customXml/itemProps2.xml><?xml version="1.0" encoding="utf-8"?>
-<ds:datastoreItem xmlns:ds="http://schemas.openxmlformats.org/officeDocument/2006/customXml" ds:itemID="{2EC9EC03-D02E-4056-A37D-CA6E9DCD92DB}">
-  <ds:schemaRefs>
-    <ds:schemaRef ds:uri="http://schemas.openxmlformats.org/officeDocument/2006/bibliography"/>
-  </ds:schemaRefs>
-</ds:datastoreItem>
 </file>
</xml_diff>